<commit_message>
Authentication register & login
</commit_message>
<xml_diff>
--- a/docs/Draft Notes - Olga.docx
+++ b/docs/Draft Notes - Olga.docx
@@ -156,9 +156,6 @@
     <w:p>
       <w:pPr>
         <w:spacing w:after="0"/>
-        <w:rPr>
-          <w:lang w:val="en-US"/>
-        </w:rPr>
       </w:pPr>
       <w:proofErr w:type="spellStart"/>
       <w:r>
@@ -1089,6 +1086,11 @@
       </w:r>
     </w:p>
     <w:p>
+      <w:pPr>
+        <w:rPr>
+          <w:lang w:val="en-US"/>
+        </w:rPr>
+      </w:pPr>
       <w:r>
         <w:t xml:space="preserve">Είναι τα </w:t>
       </w:r>
@@ -1163,6 +1165,39 @@
       </w:r>
       <w:r>
         <w:t xml:space="preserve"> ερωτήματος. Μένει να βάλω σχόλια και να εξηγήσω τον κώδικα.</w:t>
+      </w:r>
+      <w:r>
+        <w:t xml:space="preserve"> </w:t>
+      </w:r>
+      <w:r>
+        <w:t>Π</w:t>
+      </w:r>
+      <w:r>
+        <w:t xml:space="preserve">αίρνει JSON, δημιουργεί </w:t>
+      </w:r>
+      <w:proofErr w:type="spellStart"/>
+      <w:r>
+        <w:t>user</w:t>
+      </w:r>
+      <w:proofErr w:type="spellEnd"/>
+      <w:r>
+        <w:t xml:space="preserve"> και κάνει </w:t>
+      </w:r>
+      <w:proofErr w:type="spellStart"/>
+      <w:r>
+        <w:t>verify</w:t>
+      </w:r>
+      <w:proofErr w:type="spellEnd"/>
+      <w:r>
+        <w:t xml:space="preserve"> </w:t>
+      </w:r>
+      <w:proofErr w:type="spellStart"/>
+      <w:r>
+        <w:t>password</w:t>
+      </w:r>
+      <w:proofErr w:type="spellEnd"/>
+      <w:r>
+        <w:t>.</w:t>
       </w:r>
     </w:p>
     <w:p>
@@ -1482,6 +1517,7 @@
         <w:t xml:space="preserve">from </w:t>
       </w:r>
       <w:proofErr w:type="spellStart"/>
+      <w:proofErr w:type="gramStart"/>
       <w:r>
         <w:rPr>
           <w:i/>
@@ -1491,6 +1527,7 @@
         <w:t>django.shortcuts</w:t>
       </w:r>
       <w:proofErr w:type="spellEnd"/>
+      <w:proofErr w:type="gramEnd"/>
       <w:r>
         <w:rPr>
           <w:i/>
@@ -1541,22 +1578,40 @@
           <w:lang w:val="en-US"/>
         </w:rPr>
         <w:br/>
-        <w:t>return render(request, 'index.html')</w:t>
-      </w:r>
+        <w:t xml:space="preserve">return </w:t>
+      </w:r>
+      <w:proofErr w:type="gramStart"/>
       <w:r>
         <w:rPr>
           <w:i/>
           <w:iCs/>
           <w:lang w:val="en-US"/>
         </w:rPr>
-        <w:br/>
-      </w:r>
+        <w:t>render(</w:t>
+      </w:r>
+      <w:proofErr w:type="gramEnd"/>
       <w:r>
         <w:rPr>
           <w:i/>
           <w:iCs/>
           <w:lang w:val="en-US"/>
         </w:rPr>
+        <w:t>request, 'index.html')</w:t>
+      </w:r>
+      <w:r>
+        <w:rPr>
+          <w:i/>
+          <w:iCs/>
+          <w:lang w:val="en-US"/>
+        </w:rPr>
+        <w:br/>
+      </w:r>
+      <w:r>
+        <w:rPr>
+          <w:i/>
+          <w:iCs/>
+          <w:lang w:val="en-US"/>
+        </w:rPr>
         <w:br/>
         <w:t xml:space="preserve">def </w:t>
       </w:r>
@@ -1585,22 +1640,40 @@
           <w:lang w:val="en-US"/>
         </w:rPr>
         <w:br/>
-        <w:t>return render(request, 'login.html')</w:t>
-      </w:r>
+        <w:t xml:space="preserve">return </w:t>
+      </w:r>
+      <w:proofErr w:type="gramStart"/>
       <w:r>
         <w:rPr>
           <w:i/>
           <w:iCs/>
           <w:lang w:val="en-US"/>
         </w:rPr>
-        <w:br/>
-      </w:r>
+        <w:t>render(</w:t>
+      </w:r>
+      <w:proofErr w:type="gramEnd"/>
       <w:r>
         <w:rPr>
           <w:i/>
           <w:iCs/>
           <w:lang w:val="en-US"/>
         </w:rPr>
+        <w:t>request, 'login.html')</w:t>
+      </w:r>
+      <w:r>
+        <w:rPr>
+          <w:i/>
+          <w:iCs/>
+          <w:lang w:val="en-US"/>
+        </w:rPr>
+        <w:br/>
+      </w:r>
+      <w:r>
+        <w:rPr>
+          <w:i/>
+          <w:iCs/>
+          <w:lang w:val="en-US"/>
+        </w:rPr>
         <w:br/>
         <w:t xml:space="preserve">def </w:t>
       </w:r>
@@ -1629,7 +1702,25 @@
           <w:lang w:val="en-US"/>
         </w:rPr>
         <w:br/>
-        <w:t>return render(request, 'register.html')</w:t>
+        <w:t xml:space="preserve">return </w:t>
+      </w:r>
+      <w:proofErr w:type="gramStart"/>
+      <w:r>
+        <w:rPr>
+          <w:i/>
+          <w:iCs/>
+          <w:lang w:val="en-US"/>
+        </w:rPr>
+        <w:t>render(</w:t>
+      </w:r>
+      <w:proofErr w:type="gramEnd"/>
+      <w:r>
+        <w:rPr>
+          <w:i/>
+          <w:iCs/>
+          <w:lang w:val="en-US"/>
+        </w:rPr>
+        <w:t>request, 'register.html')</w:t>
       </w:r>
     </w:p>
     <w:p>
@@ -1642,23 +1733,22 @@
         <w:tabs>
           <w:tab w:val="num" w:pos="720"/>
         </w:tabs>
-        <w:rPr>
-          <w:highlight w:val="cyan"/>
-        </w:rPr>
-      </w:pPr>
-      <w:proofErr w:type="spellStart"/>
-      <w:r>
-        <w:rPr>
-          <w:highlight w:val="cyan"/>
-        </w:rPr>
-        <w:t>game_app</w:t>
-      </w:r>
-      <w:proofErr w:type="spellEnd"/>
-      <w:r>
-        <w:rPr>
-          <w:highlight w:val="cyan"/>
-        </w:rPr>
-        <w:t>/urls.py</w:t>
+      </w:pPr>
+      <w:proofErr w:type="spellStart"/>
+      <w:r>
+        <w:t>static</w:t>
+      </w:r>
+      <w:proofErr w:type="spellEnd"/>
+      <w:r>
+        <w:t>/</w:t>
+      </w:r>
+      <w:proofErr w:type="spellStart"/>
+      <w:r>
+        <w:t>js</w:t>
+      </w:r>
+      <w:proofErr w:type="spellEnd"/>
+      <w:r>
+        <w:t>/auth.js</w:t>
       </w:r>
     </w:p>
     <w:p>
@@ -1666,258 +1756,54 @@
         <w:tabs>
           <w:tab w:val="num" w:pos="720"/>
         </w:tabs>
-      </w:pPr>
-      <w:r>
-        <w:t xml:space="preserve">Επειδή το </w:t>
-      </w:r>
-      <w:proofErr w:type="spellStart"/>
-      <w:r>
-        <w:t>root</w:t>
-      </w:r>
-      <w:proofErr w:type="spellEnd"/>
-      <w:r>
-        <w:t xml:space="preserve"> </w:t>
-      </w:r>
-      <w:proofErr w:type="spellStart"/>
-      <w:r>
-        <w:t>config</w:t>
-      </w:r>
-      <w:proofErr w:type="spellEnd"/>
-      <w:r>
-        <w:t xml:space="preserve">/urls.py ήδη κάνει </w:t>
-      </w:r>
-      <w:proofErr w:type="spellStart"/>
-      <w:r>
-        <w:t>include</w:t>
-      </w:r>
-      <w:proofErr w:type="spellEnd"/>
-      <w:r>
-        <w:t xml:space="preserve"> το </w:t>
-      </w:r>
-      <w:proofErr w:type="spellStart"/>
-      <w:r>
-        <w:t>game_app</w:t>
-      </w:r>
-      <w:proofErr w:type="spellEnd"/>
-      <w:r>
-        <w:t>, άρα είναι βολικό να σερβίρεις από εκεί τις HTML σελίδες.</w:t>
-      </w:r>
-    </w:p>
-    <w:p>
-      <w:pPr>
-        <w:tabs>
-          <w:tab w:val="num" w:pos="720"/>
-        </w:tabs>
-        <w:rPr>
-          <w:i/>
-          <w:iCs/>
-          <w:lang w:val="en-US"/>
-        </w:rPr>
-      </w:pPr>
-      <w:r>
-        <w:rPr>
-          <w:i/>
-          <w:iCs/>
-          <w:lang w:val="en-US"/>
-        </w:rPr>
-        <w:t xml:space="preserve">from </w:t>
-      </w:r>
-      <w:proofErr w:type="spellStart"/>
-      <w:r>
-        <w:rPr>
-          <w:i/>
-          <w:iCs/>
-          <w:lang w:val="en-US"/>
-        </w:rPr>
-        <w:t>django.urls</w:t>
-      </w:r>
-      <w:proofErr w:type="spellEnd"/>
-      <w:r>
-        <w:rPr>
-          <w:i/>
-          <w:iCs/>
-          <w:lang w:val="en-US"/>
-        </w:rPr>
-        <w:t xml:space="preserve"> import path</w:t>
-      </w:r>
-      <w:r>
-        <w:rPr>
-          <w:i/>
-          <w:iCs/>
-          <w:lang w:val="en-US"/>
-        </w:rPr>
-        <w:br/>
-        <w:t xml:space="preserve">from .views import </w:t>
-      </w:r>
-      <w:proofErr w:type="spellStart"/>
-      <w:r>
-        <w:rPr>
-          <w:i/>
-          <w:iCs/>
-          <w:lang w:val="en-US"/>
-        </w:rPr>
-        <w:t>index_page</w:t>
-      </w:r>
-      <w:proofErr w:type="spellEnd"/>
-      <w:r>
-        <w:rPr>
-          <w:i/>
-          <w:iCs/>
-          <w:lang w:val="en-US"/>
-        </w:rPr>
-        <w:t xml:space="preserve">, </w:t>
-      </w:r>
-      <w:proofErr w:type="spellStart"/>
-      <w:r>
-        <w:rPr>
-          <w:i/>
-          <w:iCs/>
-          <w:lang w:val="en-US"/>
-        </w:rPr>
-        <w:t>login_page</w:t>
-      </w:r>
-      <w:proofErr w:type="spellEnd"/>
-      <w:r>
-        <w:rPr>
-          <w:i/>
-          <w:iCs/>
-          <w:lang w:val="en-US"/>
-        </w:rPr>
-        <w:t xml:space="preserve">, </w:t>
-      </w:r>
-      <w:proofErr w:type="spellStart"/>
-      <w:r>
-        <w:rPr>
-          <w:i/>
-          <w:iCs/>
-          <w:lang w:val="en-US"/>
-        </w:rPr>
-        <w:t>register_page</w:t>
-      </w:r>
-      <w:proofErr w:type="spellEnd"/>
-      <w:r>
-        <w:rPr>
-          <w:i/>
-          <w:iCs/>
-          <w:lang w:val="en-US"/>
-        </w:rPr>
-        <w:br/>
-      </w:r>
-      <w:r>
-        <w:rPr>
-          <w:i/>
-          <w:iCs/>
-          <w:lang w:val="en-US"/>
-        </w:rPr>
-        <w:br/>
-      </w:r>
-      <w:proofErr w:type="spellStart"/>
-      <w:r>
-        <w:rPr>
-          <w:i/>
-          <w:iCs/>
-          <w:lang w:val="en-US"/>
-        </w:rPr>
-        <w:t>urlpatterns</w:t>
-      </w:r>
-      <w:proofErr w:type="spellEnd"/>
-      <w:r>
-        <w:rPr>
-          <w:i/>
-          <w:iCs/>
-          <w:lang w:val="en-US"/>
-        </w:rPr>
-        <w:t xml:space="preserve"> = [</w:t>
-      </w:r>
-      <w:r>
-        <w:rPr>
-          <w:i/>
-          <w:iCs/>
-          <w:lang w:val="en-US"/>
-        </w:rPr>
-        <w:br/>
-        <w:t xml:space="preserve">path('', </w:t>
-      </w:r>
-      <w:proofErr w:type="spellStart"/>
-      <w:r>
-        <w:rPr>
-          <w:i/>
-          <w:iCs/>
-          <w:lang w:val="en-US"/>
-        </w:rPr>
-        <w:t>index_page</w:t>
-      </w:r>
-      <w:proofErr w:type="spellEnd"/>
-      <w:r>
-        <w:rPr>
-          <w:i/>
-          <w:iCs/>
-          <w:lang w:val="en-US"/>
-        </w:rPr>
-        <w:t>, name='index'),</w:t>
-      </w:r>
-      <w:r>
-        <w:rPr>
-          <w:i/>
-          <w:iCs/>
-          <w:lang w:val="en-US"/>
-        </w:rPr>
-        <w:br/>
-        <w:t xml:space="preserve">path('login/', </w:t>
-      </w:r>
-      <w:proofErr w:type="spellStart"/>
-      <w:r>
-        <w:rPr>
-          <w:i/>
-          <w:iCs/>
-          <w:lang w:val="en-US"/>
-        </w:rPr>
-        <w:t>login_page</w:t>
-      </w:r>
-      <w:proofErr w:type="spellEnd"/>
-      <w:r>
-        <w:rPr>
-          <w:i/>
-          <w:iCs/>
-          <w:lang w:val="en-US"/>
-        </w:rPr>
-        <w:t>, name='login-page'),</w:t>
-      </w:r>
-      <w:r>
-        <w:rPr>
-          <w:i/>
-          <w:iCs/>
-          <w:lang w:val="en-US"/>
-        </w:rPr>
-        <w:br/>
-        <w:t xml:space="preserve">path('register/', </w:t>
-      </w:r>
-      <w:proofErr w:type="spellStart"/>
-      <w:r>
-        <w:rPr>
-          <w:i/>
-          <w:iCs/>
-          <w:lang w:val="en-US"/>
-        </w:rPr>
-        <w:t>register_page</w:t>
-      </w:r>
-      <w:proofErr w:type="spellEnd"/>
-      <w:r>
-        <w:rPr>
-          <w:i/>
-          <w:iCs/>
-          <w:lang w:val="en-US"/>
-        </w:rPr>
-        <w:t>, name='register-page'),</w:t>
-      </w:r>
-      <w:r>
-        <w:rPr>
-          <w:i/>
-          <w:iCs/>
-          <w:lang w:val="en-US"/>
-        </w:rPr>
-        <w:br/>
-        <w:t>]</w:t>
+        <w:rPr>
+          <w:lang w:val="en-US"/>
+        </w:rPr>
+      </w:pPr>
+      <w:r>
+        <w:t>Κάνει</w:t>
+      </w:r>
+      <w:r>
+        <w:rPr>
+          <w:lang w:val="en-US"/>
+        </w:rPr>
+        <w:t xml:space="preserve"> </w:t>
+      </w:r>
+      <w:r>
+        <w:rPr>
+          <w:lang w:val="en-US"/>
+        </w:rPr>
+        <w:t>fetch</w:t>
+      </w:r>
+      <w:r>
+        <w:rPr>
+          <w:lang w:val="en-US"/>
+        </w:rPr>
+        <w:t xml:space="preserve">() </w:t>
+      </w:r>
+      <w:r>
+        <w:t>στα</w:t>
+      </w:r>
+      <w:r>
+        <w:rPr>
+          <w:lang w:val="en-US"/>
+        </w:rPr>
+        <w:t xml:space="preserve"> </w:t>
+      </w:r>
+      <w:r>
+        <w:rPr>
+          <w:lang w:val="en-US"/>
+        </w:rPr>
+        <w:t>Django endpoints.</w:t>
+      </w:r>
+      <w:r>
+        <w:rPr>
+          <w:lang w:val="en-US"/>
+        </w:rPr>
+        <w:t xml:space="preserve"> </w:t>
+      </w:r>
+      <w:r>
+        <w:t>Μένει να βάλω σχόλια και να εξηγήσω τον κώδικα.</w:t>
       </w:r>
     </w:p>
     <w:p>
@@ -1931,16 +1817,16 @@
           <w:tab w:val="num" w:pos="720"/>
         </w:tabs>
         <w:rPr>
-          <w:highlight w:val="cyan"/>
-          <w:lang w:val="en-US"/>
-        </w:rPr>
-      </w:pPr>
-      <w:r>
-        <w:rPr>
-          <w:highlight w:val="cyan"/>
-          <w:lang w:val="en-US"/>
-        </w:rPr>
-        <w:t>templates/index.html, register.html, login.html</w:t>
+          <w:lang w:val="en-US"/>
+        </w:rPr>
+      </w:pPr>
+      <w:proofErr w:type="spellStart"/>
+      <w:r>
+        <w:t>templates</w:t>
+      </w:r>
+      <w:proofErr w:type="spellEnd"/>
+      <w:r>
+        <w:t>/index.html</w:t>
       </w:r>
     </w:p>
     <w:p>
@@ -1948,45 +1834,44 @@
         <w:tabs>
           <w:tab w:val="num" w:pos="720"/>
         </w:tabs>
-        <w:rPr>
-          <w:lang w:val="en-US"/>
-        </w:rPr>
-      </w:pPr>
-      <w:r>
-        <w:t xml:space="preserve">Ίσως να τα σπάγαμε ώστε να είναι πιο απλό και να </w:t>
-      </w:r>
-      <w:r>
-        <w:t>ξεχωρί</w:t>
-      </w:r>
-      <w:r>
-        <w:t>ζ</w:t>
-      </w:r>
-      <w:r>
-        <w:t xml:space="preserve">ει καθαρά το </w:t>
-      </w:r>
-      <w:proofErr w:type="spellStart"/>
-      <w:r>
-        <w:t>login</w:t>
-      </w:r>
-      <w:proofErr w:type="spellEnd"/>
-      <w:r>
-        <w:t>/</w:t>
-      </w:r>
-      <w:proofErr w:type="spellStart"/>
-      <w:r>
-        <w:t>register</w:t>
-      </w:r>
-      <w:proofErr w:type="spellEnd"/>
-      <w:r>
-        <w:t xml:space="preserve"> από το </w:t>
-      </w:r>
-      <w:proofErr w:type="spellStart"/>
-      <w:r>
-        <w:t>game</w:t>
-      </w:r>
-      <w:proofErr w:type="spellEnd"/>
-      <w:r>
-        <w:t>.</w:t>
+      </w:pPr>
+      <w:r>
+        <w:t xml:space="preserve">Έβγαλα από την σειρά 101 το </w:t>
+      </w:r>
+      <w:proofErr w:type="spellStart"/>
+      <w:r>
+        <w:t>required</w:t>
+      </w:r>
+      <w:proofErr w:type="spellEnd"/>
+      <w:r>
+        <w:t xml:space="preserve"> </w:t>
+      </w:r>
+      <w:proofErr w:type="spellStart"/>
+      <w:r>
+        <w:t>value</w:t>
+      </w:r>
+      <w:proofErr w:type="spellEnd"/>
+      <w:r>
+        <w:t>="player1</w:t>
+      </w:r>
+      <w:r>
+        <w:t xml:space="preserve">" και από την 105 το </w:t>
+      </w:r>
+      <w:proofErr w:type="spellStart"/>
+      <w:r>
+        <w:t>required</w:t>
+      </w:r>
+      <w:proofErr w:type="spellEnd"/>
+      <w:r>
+        <w:t xml:space="preserve"> </w:t>
+      </w:r>
+      <w:proofErr w:type="spellStart"/>
+      <w:r>
+        <w:t>value</w:t>
+      </w:r>
+      <w:proofErr w:type="spellEnd"/>
+      <w:r>
+        <w:t>="123456"</w:t>
       </w:r>
     </w:p>
     <w:p>
@@ -1998,6 +1883,171 @@
           <w:lang w:val="en-US"/>
         </w:rPr>
       </w:pPr>
+      <w:r>
+        <w:t>Ίσως</w:t>
+      </w:r>
+      <w:r>
+        <w:rPr>
+          <w:lang w:val="en-US"/>
+        </w:rPr>
+        <w:t xml:space="preserve"> </w:t>
+      </w:r>
+      <w:r>
+        <w:t>για</w:t>
+      </w:r>
+      <w:r>
+        <w:rPr>
+          <w:lang w:val="en-US"/>
+        </w:rPr>
+        <w:t xml:space="preserve"> </w:t>
+      </w:r>
+      <w:r>
+        <w:t>εναλλαγή</w:t>
+      </w:r>
+      <w:r>
+        <w:rPr>
+          <w:lang w:val="en-US"/>
+        </w:rPr>
+        <w:t xml:space="preserve"> </w:t>
+      </w:r>
+      <w:r>
+        <w:t>μεταξύ</w:t>
+      </w:r>
+      <w:r>
+        <w:rPr>
+          <w:lang w:val="en-US"/>
+        </w:rPr>
+        <w:t xml:space="preserve"> </w:t>
+      </w:r>
+      <w:r>
+        <w:t>τους</w:t>
+      </w:r>
+      <w:r>
+        <w:rPr>
+          <w:lang w:val="en-US"/>
+        </w:rPr>
+        <w:t xml:space="preserve"> </w:t>
+      </w:r>
+      <w:r>
+        <w:t>πρέπει</w:t>
+      </w:r>
+      <w:r>
+        <w:rPr>
+          <w:lang w:val="en-US"/>
+        </w:rPr>
+        <w:t xml:space="preserve"> </w:t>
+      </w:r>
+      <w:r>
+        <w:t>να</w:t>
+      </w:r>
+      <w:r>
+        <w:rPr>
+          <w:lang w:val="en-US"/>
+        </w:rPr>
+        <w:t xml:space="preserve"> </w:t>
+      </w:r>
+      <w:r>
+        <w:t>βάλω</w:t>
+      </w:r>
+      <w:r>
+        <w:rPr>
+          <w:lang w:val="en-US"/>
+        </w:rPr>
+        <w:t xml:space="preserve"> </w:t>
+      </w:r>
+      <w:r>
+        <w:t>και</w:t>
+      </w:r>
+      <w:r>
+        <w:rPr>
+          <w:lang w:val="en-US"/>
+        </w:rPr>
+        <w:t xml:space="preserve"> </w:t>
+      </w:r>
+      <w:r>
+        <w:t>αυτό</w:t>
+      </w:r>
+      <w:r>
+        <w:rPr>
+          <w:lang w:val="en-US"/>
+        </w:rPr>
+        <w:t>:</w:t>
+      </w:r>
+      <w:r>
+        <w:rPr>
+          <w:lang w:val="en-US"/>
+        </w:rPr>
+        <w:br/>
+      </w:r>
+      <w:r>
+        <w:rPr>
+          <w:lang w:val="en-US"/>
+        </w:rPr>
+        <w:t xml:space="preserve">&lt;a </w:t>
+      </w:r>
+      <w:proofErr w:type="spellStart"/>
+      <w:r>
+        <w:rPr>
+          <w:lang w:val="en-US"/>
+        </w:rPr>
+        <w:t>href</w:t>
+      </w:r>
+      <w:proofErr w:type="spellEnd"/>
+      <w:r>
+        <w:rPr>
+          <w:lang w:val="en-US"/>
+        </w:rPr>
+        <w:t>="#" onclick="</w:t>
+      </w:r>
+      <w:proofErr w:type="spellStart"/>
+      <w:r>
+        <w:rPr>
+          <w:lang w:val="en-US"/>
+        </w:rPr>
+        <w:t>AuthService.toggleForms</w:t>
+      </w:r>
+      <w:proofErr w:type="spellEnd"/>
+      <w:r>
+        <w:rPr>
+          <w:lang w:val="en-US"/>
+        </w:rPr>
+        <w:t>(); return false;"&gt;Register&lt;/a&gt;</w:t>
+      </w:r>
+      <w:r>
+        <w:rPr>
+          <w:lang w:val="en-US"/>
+        </w:rPr>
+        <w:br/>
+        <w:t xml:space="preserve">&lt;a </w:t>
+      </w:r>
+      <w:proofErr w:type="spellStart"/>
+      <w:r>
+        <w:rPr>
+          <w:lang w:val="en-US"/>
+        </w:rPr>
+        <w:t>href</w:t>
+      </w:r>
+      <w:proofErr w:type="spellEnd"/>
+      <w:r>
+        <w:rPr>
+          <w:lang w:val="en-US"/>
+        </w:rPr>
+        <w:t>="#" onclick="</w:t>
+      </w:r>
+      <w:proofErr w:type="spellStart"/>
+      <w:r>
+        <w:rPr>
+          <w:lang w:val="en-US"/>
+        </w:rPr>
+        <w:t>AuthService.toggleForms</w:t>
+      </w:r>
+      <w:proofErr w:type="spellEnd"/>
+      <w:r>
+        <w:rPr>
+          <w:lang w:val="en-US"/>
+        </w:rPr>
+        <w:t>(); return false;"&gt;Login&lt;/a&gt;</w:t>
+      </w:r>
     </w:p>
     <w:p>
       <w:pPr>
@@ -2005,9 +2055,18 @@
           <w:tab w:val="num" w:pos="720"/>
         </w:tabs>
         <w:rPr>
+          <w:lang w:val="en-US"/>
+        </w:rPr>
+      </w:pPr>
+    </w:p>
+    <w:p>
+      <w:pPr>
+        <w:tabs>
+          <w:tab w:val="num" w:pos="720"/>
+        </w:tabs>
+        <w:rPr>
           <w:b/>
           <w:bCs/>
-          <w:lang w:val="en-US"/>
         </w:rPr>
       </w:pPr>
       <w:r>
@@ -2021,9 +2080,16 @@
         <w:rPr>
           <w:b/>
           <w:bCs/>
-          <w:lang w:val="en-US"/>
-        </w:rPr>
-        <w:t xml:space="preserve"> MySQL</w:t>
+        </w:rPr>
+        <w:t xml:space="preserve"> </w:t>
+      </w:r>
+      <w:r>
+        <w:rPr>
+          <w:b/>
+          <w:bCs/>
+          <w:lang w:val="en-US"/>
+        </w:rPr>
+        <w:t>MySQL</w:t>
       </w:r>
     </w:p>
     <w:p>
@@ -2056,19 +2122,7 @@
         <w:rPr>
           <w:lang w:val="en-US"/>
         </w:rPr>
-        <w:t xml:space="preserve"> </w:t>
-      </w:r>
-      <w:r>
-        <w:rPr>
-          <w:lang w:val="en-US"/>
-        </w:rPr>
-        <w:t>MySQL Installer</w:t>
-      </w:r>
-      <w:r>
-        <w:rPr>
-          <w:lang w:val="en-US"/>
-        </w:rPr>
-        <w:t xml:space="preserve"> (</w:t>
+        <w:t xml:space="preserve"> MySQL Installer (</w:t>
       </w:r>
       <w:r>
         <w:rPr>
@@ -2145,6 +2199,9 @@
         </w:tabs>
       </w:pPr>
       <w:r>
+        <w:rPr>
+          <w:noProof/>
+        </w:rPr>
         <w:drawing>
           <wp:inline distT="0" distB="0" distL="0" distR="0" wp14:anchorId="503B52CF" wp14:editId="7D1EAEB6">
             <wp:extent cx="5219700" cy="2051273"/>
@@ -2197,7 +2254,6 @@
         <w:rPr>
           <w:lang w:val="en-US"/>
         </w:rPr>
-        <w:lastRenderedPageBreak/>
         <w:t xml:space="preserve">Next </w:t>
       </w:r>
       <w:r>
@@ -2222,10 +2278,7 @@
         </w:tabs>
       </w:pPr>
       <w:r>
-        <w:t xml:space="preserve">ΠΡΟΣΟΧΗ </w:t>
-      </w:r>
-      <w:r>
-        <w:t xml:space="preserve">να βάλεις </w:t>
+        <w:t xml:space="preserve">ΠΡΟΣΟΧΗ να βάλεις </w:t>
       </w:r>
       <w:r>
         <w:rPr>
@@ -2369,6 +2422,7 @@
         </w:tabs>
       </w:pPr>
       <w:r>
+        <w:lastRenderedPageBreak/>
         <w:t xml:space="preserve">Φτιάξε σύνδεση στο </w:t>
       </w:r>
       <w:r>
@@ -2398,6 +2452,7 @@
       </w:pPr>
       <w:r>
         <w:rPr>
+          <w:noProof/>
           <w:lang w:val="en-US"/>
         </w:rPr>
         <w:drawing>
@@ -2537,6 +2592,7 @@
       </w:pPr>
       <w:r>
         <w:rPr>
+          <w:noProof/>
           <w:lang w:val="en-US"/>
         </w:rPr>
         <w:drawing>
@@ -2581,9 +2637,6 @@
         <w:tabs>
           <w:tab w:val="num" w:pos="720"/>
         </w:tabs>
-        <w:rPr>
-          <w:lang w:val="en-US"/>
-        </w:rPr>
       </w:pPr>
       <w:r>
         <w:t xml:space="preserve">Έλεγξε ότι δημιουργήθηκε γράφοντας </w:t>
@@ -2698,6 +2751,9 @@
         <w:tabs>
           <w:tab w:val="num" w:pos="720"/>
         </w:tabs>
+        <w:rPr>
+          <w:lang w:val="en-US"/>
+        </w:rPr>
       </w:pPr>
     </w:p>
     <w:p>
@@ -2705,40 +2761,104 @@
         <w:tabs>
           <w:tab w:val="num" w:pos="720"/>
         </w:tabs>
-      </w:pPr>
+        <w:rPr>
+          <w:b/>
+          <w:bCs/>
+          <w:lang w:val="en-US"/>
+        </w:rPr>
+      </w:pPr>
+      <w:r>
+        <w:rPr>
+          <w:b/>
+          <w:bCs/>
+          <w:lang w:val="en-US"/>
+        </w:rPr>
+        <w:t xml:space="preserve">Terminal </w:t>
+      </w:r>
+      <w:r>
+        <w:rPr>
+          <w:b/>
+          <w:bCs/>
+        </w:rPr>
+        <w:t>Εντολές</w:t>
+      </w:r>
     </w:p>
     <w:p>
       <w:pPr>
         <w:tabs>
           <w:tab w:val="num" w:pos="720"/>
         </w:tabs>
-      </w:pPr>
+        <w:rPr>
+          <w:lang w:val="en-US"/>
+        </w:rPr>
+      </w:pPr>
+      <w:r>
+        <w:rPr>
+          <w:lang w:val="en-US"/>
+        </w:rPr>
+        <w:t>pip install -r requirements.txt</w:t>
+      </w:r>
     </w:p>
     <w:p>
       <w:pPr>
         <w:tabs>
           <w:tab w:val="num" w:pos="720"/>
         </w:tabs>
-        <w:rPr>
-          <w:b/>
-          <w:bCs/>
-        </w:rPr>
-      </w:pPr>
-      <w:r>
-        <w:rPr>
-          <w:b/>
-          <w:bCs/>
-          <w:lang w:val="en-US"/>
-        </w:rPr>
-        <w:lastRenderedPageBreak/>
-        <w:t xml:space="preserve">Terminal </w:t>
-      </w:r>
-      <w:r>
-        <w:rPr>
-          <w:b/>
-          <w:bCs/>
-        </w:rPr>
-        <w:t>Εντολές</w:t>
+        <w:spacing w:after="0"/>
+      </w:pPr>
+      <w:r>
+        <w:t xml:space="preserve"># </w:t>
+      </w:r>
+      <w:r>
+        <w:t>Για</w:t>
+      </w:r>
+      <w:r>
+        <w:t xml:space="preserve"> </w:t>
+      </w:r>
+      <w:r>
+        <w:t>να</w:t>
+      </w:r>
+      <w:r>
+        <w:t xml:space="preserve"> </w:t>
+      </w:r>
+      <w:r>
+        <w:t>δω</w:t>
+      </w:r>
+      <w:r>
+        <w:t xml:space="preserve"> </w:t>
+      </w:r>
+      <w:r>
+        <w:t>ότι</w:t>
+      </w:r>
+      <w:r>
+        <w:t xml:space="preserve"> </w:t>
+      </w:r>
+      <w:r>
+        <w:t>τ</w:t>
+      </w:r>
+      <w:r>
+        <w:t>ο</w:t>
+      </w:r>
+      <w:r>
+        <w:t xml:space="preserve"> </w:t>
+      </w:r>
+      <w:r>
+        <w:rPr>
+          <w:lang w:val="en-US"/>
+        </w:rPr>
+        <w:t>config</w:t>
+      </w:r>
+      <w:r>
+        <w:t xml:space="preserve"> </w:t>
+      </w:r>
+      <w:r>
+        <w:t>είναι</w:t>
+      </w:r>
+      <w:r>
+        <w:t xml:space="preserve"> </w:t>
+      </w:r>
+      <w:r>
+        <w:t>εντάξει</w:t>
       </w:r>
     </w:p>
     <w:p>
@@ -2746,15 +2866,41 @@
         <w:tabs>
           <w:tab w:val="num" w:pos="720"/>
         </w:tabs>
-        <w:rPr>
-          <w:lang w:val="en-US"/>
-        </w:rPr>
-      </w:pPr>
-      <w:r>
-        <w:rPr>
-          <w:lang w:val="en-US"/>
-        </w:rPr>
-        <w:t>pip install -r requirements.txt</w:t>
+      </w:pPr>
+      <w:r>
+        <w:rPr>
+          <w:lang w:val="en-US"/>
+        </w:rPr>
+        <w:t>python</w:t>
+      </w:r>
+      <w:r>
+        <w:t xml:space="preserve"> </w:t>
+      </w:r>
+      <w:r>
+        <w:rPr>
+          <w:lang w:val="en-US"/>
+        </w:rPr>
+        <w:t>manage</w:t>
+      </w:r>
+      <w:r>
+        <w:t>.</w:t>
+      </w:r>
+      <w:proofErr w:type="spellStart"/>
+      <w:r>
+        <w:rPr>
+          <w:lang w:val="en-US"/>
+        </w:rPr>
+        <w:t>py</w:t>
+      </w:r>
+      <w:proofErr w:type="spellEnd"/>
+      <w:r>
+        <w:t xml:space="preserve"> </w:t>
+      </w:r>
+      <w:r>
+        <w:rPr>
+          <w:lang w:val="en-US"/>
+        </w:rPr>
+        <w:t>check</w:t>
       </w:r>
     </w:p>
     <w:p>
@@ -2780,47 +2926,79 @@
         <w:t xml:space="preserve"> </w:t>
       </w:r>
       <w:r>
-        <w:t>δω</w:t>
-      </w:r>
-      <w:r>
-        <w:t xml:space="preserve"> </w:t>
-      </w:r>
-      <w:r>
-        <w:t>ό</w:t>
-      </w:r>
-      <w:r>
-        <w:t>τ</w:t>
-      </w:r>
-      <w:r>
-        <w:t>ι</w:t>
-      </w:r>
-      <w:r>
-        <w:t xml:space="preserve"> </w:t>
-      </w:r>
-      <w:r>
-        <w:t>ρο</w:t>
-      </w:r>
-      <w:r>
-        <w:t xml:space="preserve"> </w:t>
-      </w:r>
-      <w:r>
-        <w:rPr>
-          <w:lang w:val="en-US"/>
-        </w:rPr>
-        <w:t>config</w:t>
-      </w:r>
-      <w:r>
-        <w:t xml:space="preserve"> </w:t>
-      </w:r>
-      <w:r>
-        <w:t>είναι</w:t>
-      </w:r>
-      <w:r>
-        <w:t xml:space="preserve"> </w:t>
-      </w:r>
-      <w:r>
-        <w:t>εντάξει</w:t>
-      </w:r>
+        <w:t>βεβαιωθώ</w:t>
+      </w:r>
+      <w:r>
+        <w:t xml:space="preserve"> </w:t>
+      </w:r>
+      <w:r>
+        <w:t>ότι</w:t>
+      </w:r>
+      <w:r>
+        <w:t xml:space="preserve"> </w:t>
+      </w:r>
+      <w:r>
+        <w:t xml:space="preserve">ο πίνακας του </w:t>
+      </w:r>
+      <w:r>
+        <w:rPr>
+          <w:lang w:val="en-US"/>
+        </w:rPr>
+        <w:t>model</w:t>
+      </w:r>
+      <w:r>
+        <w:t xml:space="preserve"> </w:t>
+      </w:r>
+      <w:r>
+        <w:t>δημιουργήθηκε στη βάση</w:t>
+      </w:r>
+      <w:r>
+        <w:t xml:space="preserve">. </w:t>
+      </w:r>
+      <w:r>
+        <w:t>Αυτά</w:t>
+      </w:r>
+      <w:r>
+        <w:t xml:space="preserve"> </w:t>
+      </w:r>
+      <w:r>
+        <w:t>τα</w:t>
+      </w:r>
+      <w:r>
+        <w:t xml:space="preserve"> </w:t>
+      </w:r>
+      <w:r>
+        <w:t>τρέχουμε</w:t>
+      </w:r>
+      <w:r>
+        <w:t xml:space="preserve"> </w:t>
+      </w:r>
+      <w:r>
+        <w:t>μόνο</w:t>
+      </w:r>
+      <w:r>
+        <w:t xml:space="preserve"> </w:t>
+      </w:r>
+      <w:r>
+        <w:t xml:space="preserve">όταν αλλάζουμε τα </w:t>
+      </w:r>
+      <w:r>
+        <w:rPr>
+          <w:lang w:val="en-US"/>
+        </w:rPr>
+        <w:t>models</w:t>
+      </w:r>
+      <w:r>
+        <w:t>.</w:t>
+      </w:r>
+      <w:proofErr w:type="spellStart"/>
+      <w:r>
+        <w:rPr>
+          <w:lang w:val="en-US"/>
+        </w:rPr>
+        <w:t>py</w:t>
+      </w:r>
+      <w:proofErr w:type="spellEnd"/>
     </w:p>
     <w:p>
       <w:pPr>
@@ -2832,124 +3010,31 @@
         <w:rPr>
           <w:lang w:val="en-US"/>
         </w:rPr>
-        <w:t>python manage.py check</w:t>
-      </w:r>
-    </w:p>
-    <w:p>
-      <w:pPr>
-        <w:tabs>
-          <w:tab w:val="num" w:pos="720"/>
-        </w:tabs>
-        <w:spacing w:after="0"/>
-        <w:rPr>
-          <w:lang w:val="en-US"/>
-        </w:rPr>
-      </w:pPr>
-      <w:r>
-        <w:t xml:space="preserve"># </w:t>
-      </w:r>
-      <w:r>
-        <w:t>Για</w:t>
-      </w:r>
-      <w:r>
-        <w:t xml:space="preserve"> </w:t>
-      </w:r>
-      <w:r>
-        <w:t>να</w:t>
-      </w:r>
-      <w:r>
-        <w:t xml:space="preserve"> </w:t>
-      </w:r>
-      <w:r>
-        <w:t>βεβαιωθώ</w:t>
-      </w:r>
-      <w:r>
-        <w:t xml:space="preserve"> </w:t>
-      </w:r>
-      <w:r>
-        <w:t>ότι</w:t>
-      </w:r>
-      <w:r>
-        <w:t xml:space="preserve"> </w:t>
-      </w:r>
-      <w:r>
-        <w:t xml:space="preserve">ο πίνακας του </w:t>
-      </w:r>
-      <w:r>
-        <w:rPr>
-          <w:lang w:val="en-US"/>
-        </w:rPr>
-        <w:t>model</w:t>
-      </w:r>
-      <w:r>
-        <w:t xml:space="preserve"> </w:t>
-      </w:r>
-      <w:r>
-        <w:t>δημιουργήθηκε στη βάση</w:t>
-      </w:r>
-      <w:r>
-        <w:t xml:space="preserve">. </w:t>
-      </w:r>
-      <w:r>
-        <w:t>Αυτά</w:t>
-      </w:r>
-      <w:r>
-        <w:rPr>
-          <w:lang w:val="en-US"/>
-        </w:rPr>
-        <w:t xml:space="preserve"> </w:t>
-      </w:r>
-      <w:r>
-        <w:t>τα</w:t>
-      </w:r>
-      <w:r>
-        <w:rPr>
-          <w:lang w:val="en-US"/>
-        </w:rPr>
-        <w:t xml:space="preserve"> </w:t>
-      </w:r>
-      <w:r>
-        <w:t>τρέχουμε</w:t>
-      </w:r>
-      <w:r>
-        <w:rPr>
-          <w:lang w:val="en-US"/>
-        </w:rPr>
-        <w:t xml:space="preserve"> </w:t>
-      </w:r>
-      <w:r>
-        <w:t>μόνο</w:t>
-      </w:r>
-      <w:r>
-        <w:rPr>
-          <w:lang w:val="en-US"/>
-        </w:rPr>
-        <w:t xml:space="preserve"> </w:t>
-      </w:r>
-      <w:r>
-        <w:t xml:space="preserve">όταν αλλάζουμε τα </w:t>
-      </w:r>
-      <w:r>
-        <w:rPr>
-          <w:lang w:val="en-US"/>
-        </w:rPr>
-        <w:t>models.py</w:t>
-      </w:r>
-    </w:p>
-    <w:p>
-      <w:pPr>
-        <w:tabs>
-          <w:tab w:val="num" w:pos="720"/>
-        </w:tabs>
-        <w:rPr>
-          <w:lang w:val="en-US"/>
-        </w:rPr>
-      </w:pPr>
-      <w:r>
-        <w:rPr>
-          <w:lang w:val="en-US"/>
-        </w:rPr>
-        <w:t xml:space="preserve">python manage.py </w:t>
+        <w:lastRenderedPageBreak/>
+        <w:t>python</w:t>
+      </w:r>
+      <w:r>
+        <w:t xml:space="preserve"> </w:t>
+      </w:r>
+      <w:r>
+        <w:rPr>
+          <w:lang w:val="en-US"/>
+        </w:rPr>
+        <w:t>manage</w:t>
+      </w:r>
+      <w:r>
+        <w:t>.</w:t>
+      </w:r>
+      <w:proofErr w:type="spellStart"/>
+      <w:r>
+        <w:rPr>
+          <w:lang w:val="en-US"/>
+        </w:rPr>
+        <w:t>py</w:t>
+      </w:r>
+      <w:proofErr w:type="spellEnd"/>
+      <w:r>
+        <w:t xml:space="preserve"> </w:t>
       </w:r>
       <w:proofErr w:type="spellStart"/>
       <w:r>
@@ -2960,11 +3045,42 @@
       </w:r>
       <w:proofErr w:type="spellEnd"/>
       <w:r>
-        <w:rPr>
-          <w:lang w:val="en-US"/>
-        </w:rPr>
         <w:br/>
-        <w:t>python manage.py migrate</w:t>
+      </w:r>
+      <w:r>
+        <w:rPr>
+          <w:lang w:val="en-US"/>
+        </w:rPr>
+        <w:t>python</w:t>
+      </w:r>
+      <w:r>
+        <w:t xml:space="preserve"> </w:t>
+      </w:r>
+      <w:r>
+        <w:rPr>
+          <w:lang w:val="en-US"/>
+        </w:rPr>
+        <w:t>manage</w:t>
+      </w:r>
+      <w:r>
+        <w:t>.</w:t>
+      </w:r>
+      <w:proofErr w:type="spellStart"/>
+      <w:r>
+        <w:rPr>
+          <w:lang w:val="en-US"/>
+        </w:rPr>
+        <w:t>py</w:t>
+      </w:r>
+      <w:proofErr w:type="spellEnd"/>
+      <w:r>
+        <w:t xml:space="preserve"> </w:t>
+      </w:r>
+      <w:r>
+        <w:rPr>
+          <w:lang w:val="en-US"/>
+        </w:rPr>
+        <w:t>migrate</w:t>
       </w:r>
     </w:p>
     <w:p>
@@ -3063,9 +3179,6 @@
         <w:tabs>
           <w:tab w:val="num" w:pos="720"/>
         </w:tabs>
-        <w:rPr>
-          <w:lang w:val="en-US"/>
-        </w:rPr>
       </w:pPr>
     </w:p>
     <w:p>
@@ -3092,6 +3205,9 @@
           <w:tab w:val="num" w:pos="720"/>
         </w:tabs>
         <w:spacing w:after="0"/>
+        <w:rPr>
+          <w:lang w:val="en-US"/>
+        </w:rPr>
       </w:pPr>
       <w:proofErr w:type="spellStart"/>
       <w:r>
@@ -3219,6 +3335,9 @@
         <w:tabs>
           <w:tab w:val="num" w:pos="720"/>
         </w:tabs>
+        <w:rPr>
+          <w:lang w:val="en-US"/>
+        </w:rPr>
       </w:pPr>
     </w:p>
     <w:p>
@@ -3244,6 +3363,9 @@
         <w:tabs>
           <w:tab w:val="num" w:pos="720"/>
         </w:tabs>
+        <w:rPr>
+          <w:lang w:val="en-US"/>
+        </w:rPr>
       </w:pPr>
       <w:r>
         <w:t xml:space="preserve">Σταματάς τον </w:t>
@@ -3287,6 +3409,768 @@
       <w:proofErr w:type="spellStart"/>
       <w:r>
         <w:t>deactivate</w:t>
+      </w:r>
+      <w:proofErr w:type="spellEnd"/>
+      <w:r>
+        <w:t>.</w:t>
+      </w:r>
+    </w:p>
+    <w:p>
+      <w:pPr>
+        <w:tabs>
+          <w:tab w:val="num" w:pos="720"/>
+        </w:tabs>
+        <w:rPr>
+          <w:lang w:val="en-US"/>
+        </w:rPr>
+      </w:pPr>
+    </w:p>
+    <w:p>
+      <w:pPr>
+        <w:tabs>
+          <w:tab w:val="num" w:pos="720"/>
+        </w:tabs>
+        <w:rPr>
+          <w:b/>
+          <w:bCs/>
+        </w:rPr>
+      </w:pPr>
+      <w:r>
+        <w:rPr>
+          <w:b/>
+          <w:bCs/>
+        </w:rPr>
+        <w:t>Λειτουργία με χρήστη από τη βάση</w:t>
+      </w:r>
+    </w:p>
+    <w:p>
+      <w:pPr>
+        <w:pStyle w:val="a6"/>
+        <w:numPr>
+          <w:ilvl w:val="0"/>
+          <w:numId w:val="28"/>
+        </w:numPr>
+        <w:tabs>
+          <w:tab w:val="num" w:pos="720"/>
+        </w:tabs>
+      </w:pPr>
+      <w:r>
+        <w:t xml:space="preserve">Συμπλήρωσε το </w:t>
+      </w:r>
+      <w:proofErr w:type="spellStart"/>
+      <w:r>
+        <w:t>register</w:t>
+      </w:r>
+      <w:proofErr w:type="spellEnd"/>
+      <w:r>
+        <w:t xml:space="preserve"> </w:t>
+      </w:r>
+      <w:proofErr w:type="spellStart"/>
+      <w:r>
+        <w:t>form</w:t>
+      </w:r>
+      <w:proofErr w:type="spellEnd"/>
+      <w:r>
+        <w:t xml:space="preserve"> και πάτα </w:t>
+      </w:r>
+      <w:proofErr w:type="spellStart"/>
+      <w:r>
+        <w:t>Sign</w:t>
+      </w:r>
+      <w:proofErr w:type="spellEnd"/>
+      <w:r>
+        <w:t xml:space="preserve"> </w:t>
+      </w:r>
+      <w:proofErr w:type="spellStart"/>
+      <w:r>
+        <w:t>Up.</w:t>
+      </w:r>
+      <w:proofErr w:type="spellEnd"/>
+    </w:p>
+    <w:p>
+      <w:pPr>
+        <w:pStyle w:val="a6"/>
+        <w:numPr>
+          <w:ilvl w:val="0"/>
+          <w:numId w:val="28"/>
+        </w:numPr>
+        <w:tabs>
+          <w:tab w:val="num" w:pos="720"/>
+        </w:tabs>
+      </w:pPr>
+      <w:r>
+        <w:t xml:space="preserve">Πρέπει να δεις επιτυχία και μετά να γυρίσεις στο </w:t>
+      </w:r>
+      <w:proofErr w:type="spellStart"/>
+      <w:r>
+        <w:t>login</w:t>
+      </w:r>
+      <w:proofErr w:type="spellEnd"/>
+      <w:r>
+        <w:t xml:space="preserve"> </w:t>
+      </w:r>
+      <w:proofErr w:type="spellStart"/>
+      <w:r>
+        <w:t>form.</w:t>
+      </w:r>
+      <w:proofErr w:type="spellEnd"/>
+    </w:p>
+    <w:p>
+      <w:pPr>
+        <w:pStyle w:val="a6"/>
+        <w:numPr>
+          <w:ilvl w:val="0"/>
+          <w:numId w:val="28"/>
+        </w:numPr>
+        <w:tabs>
+          <w:tab w:val="num" w:pos="720"/>
+        </w:tabs>
+      </w:pPr>
+      <w:r>
+        <w:t xml:space="preserve">Κάνε </w:t>
+      </w:r>
+      <w:proofErr w:type="spellStart"/>
+      <w:r>
+        <w:t>login</w:t>
+      </w:r>
+      <w:proofErr w:type="spellEnd"/>
+      <w:r>
+        <w:t xml:space="preserve"> με τα ίδια στοιχεία.</w:t>
+      </w:r>
+    </w:p>
+    <w:p>
+      <w:pPr>
+        <w:pStyle w:val="a6"/>
+        <w:numPr>
+          <w:ilvl w:val="0"/>
+          <w:numId w:val="28"/>
+        </w:numPr>
+        <w:tabs>
+          <w:tab w:val="num" w:pos="720"/>
+        </w:tabs>
+      </w:pPr>
+      <w:r>
+        <w:t xml:space="preserve">Αν θες να δεις ότι γράφτηκε ο χρήστης, μπορείς να μπεις στο </w:t>
+      </w:r>
+      <w:proofErr w:type="spellStart"/>
+      <w:r>
+        <w:t>Django</w:t>
+      </w:r>
+      <w:proofErr w:type="spellEnd"/>
+      <w:r>
+        <w:t xml:space="preserve"> </w:t>
+      </w:r>
+      <w:proofErr w:type="spellStart"/>
+      <w:r>
+        <w:t>shell</w:t>
+      </w:r>
+      <w:proofErr w:type="spellEnd"/>
+      <w:r>
+        <w:t>:</w:t>
+      </w:r>
+      <w:r>
+        <w:t xml:space="preserve"> </w:t>
+      </w:r>
+      <w:r>
+        <w:rPr>
+          <w:lang w:val="en-US"/>
+        </w:rPr>
+        <w:t>python</w:t>
+      </w:r>
+      <w:r>
+        <w:t xml:space="preserve"> </w:t>
+      </w:r>
+      <w:r>
+        <w:rPr>
+          <w:lang w:val="en-US"/>
+        </w:rPr>
+        <w:t>manage</w:t>
+      </w:r>
+      <w:r>
+        <w:t>.</w:t>
+      </w:r>
+      <w:proofErr w:type="spellStart"/>
+      <w:r>
+        <w:rPr>
+          <w:lang w:val="en-US"/>
+        </w:rPr>
+        <w:t>py</w:t>
+      </w:r>
+      <w:proofErr w:type="spellEnd"/>
+      <w:r>
+        <w:t xml:space="preserve"> </w:t>
+      </w:r>
+      <w:r>
+        <w:rPr>
+          <w:lang w:val="en-US"/>
+        </w:rPr>
+        <w:t>shell</w:t>
+      </w:r>
+    </w:p>
+    <w:p>
+      <w:pPr>
+        <w:tabs>
+          <w:tab w:val="num" w:pos="720"/>
+        </w:tabs>
+        <w:ind w:left="360"/>
+        <w:rPr>
+          <w:lang w:val="en-US"/>
+        </w:rPr>
+      </w:pPr>
+      <w:r>
+        <w:t>και</w:t>
+      </w:r>
+      <w:r>
+        <w:rPr>
+          <w:lang w:val="en-US"/>
+        </w:rPr>
+        <w:t>:</w:t>
+      </w:r>
+    </w:p>
+    <w:p>
+      <w:pPr>
+        <w:tabs>
+          <w:tab w:val="num" w:pos="720"/>
+        </w:tabs>
+        <w:ind w:left="360"/>
+        <w:rPr>
+          <w:lang w:val="en-US"/>
+        </w:rPr>
+      </w:pPr>
+      <w:r>
+        <w:rPr>
+          <w:lang w:val="en-US"/>
+        </w:rPr>
+        <w:t xml:space="preserve">from </w:t>
+      </w:r>
+      <w:proofErr w:type="spellStart"/>
+      <w:proofErr w:type="gramStart"/>
+      <w:r>
+        <w:rPr>
+          <w:lang w:val="en-US"/>
+        </w:rPr>
+        <w:t>accounts.models</w:t>
+      </w:r>
+      <w:proofErr w:type="spellEnd"/>
+      <w:proofErr w:type="gramEnd"/>
+      <w:r>
+        <w:rPr>
+          <w:lang w:val="en-US"/>
+        </w:rPr>
+        <w:t xml:space="preserve"> import </w:t>
+      </w:r>
+      <w:proofErr w:type="spellStart"/>
+      <w:r>
+        <w:rPr>
+          <w:lang w:val="en-US"/>
+        </w:rPr>
+        <w:t>AppUser</w:t>
+      </w:r>
+      <w:proofErr w:type="spellEnd"/>
+      <w:r>
+        <w:rPr>
+          <w:lang w:val="en-US"/>
+        </w:rPr>
+        <w:br/>
+      </w:r>
+      <w:proofErr w:type="spellStart"/>
+      <w:proofErr w:type="gramStart"/>
+      <w:r>
+        <w:rPr>
+          <w:lang w:val="en-US"/>
+        </w:rPr>
+        <w:t>AppUser</w:t>
+      </w:r>
+      <w:r>
+        <w:rPr>
+          <w:lang w:val="en-US"/>
+        </w:rPr>
+        <w:t>.objects.all</w:t>
+      </w:r>
+      <w:proofErr w:type="spellEnd"/>
+      <w:r>
+        <w:rPr>
+          <w:lang w:val="en-US"/>
+        </w:rPr>
+        <w:t>(</w:t>
+      </w:r>
+      <w:proofErr w:type="gramEnd"/>
+      <w:r>
+        <w:rPr>
+          <w:lang w:val="en-US"/>
+        </w:rPr>
+        <w:t>)</w:t>
+      </w:r>
+    </w:p>
+    <w:p>
+      <w:pPr>
+        <w:tabs>
+          <w:tab w:val="num" w:pos="720"/>
+        </w:tabs>
+      </w:pPr>
+      <w:r>
+        <w:t xml:space="preserve">Για να δεις ότι ο χρήστης γράφτηκε στην βάση που φτιάξαμε στην </w:t>
+      </w:r>
+      <w:r>
+        <w:rPr>
+          <w:lang w:val="en-US"/>
+        </w:rPr>
+        <w:t>MySQL</w:t>
+      </w:r>
+      <w:r>
+        <w:t xml:space="preserve">, </w:t>
+      </w:r>
+      <w:r>
+        <w:t>κάνε τα εξής:</w:t>
+      </w:r>
+    </w:p>
+    <w:p>
+      <w:pPr>
+        <w:numPr>
+          <w:ilvl w:val="0"/>
+          <w:numId w:val="29"/>
+        </w:numPr>
+        <w:spacing w:after="0"/>
+      </w:pPr>
+      <w:r>
+        <w:t xml:space="preserve">Άνοιξε </w:t>
+      </w:r>
+      <w:proofErr w:type="spellStart"/>
+      <w:r>
+        <w:t>MySQL</w:t>
+      </w:r>
+      <w:proofErr w:type="spellEnd"/>
+      <w:r>
+        <w:t xml:space="preserve"> </w:t>
+      </w:r>
+      <w:proofErr w:type="spellStart"/>
+      <w:r>
+        <w:t>Workbench.</w:t>
+      </w:r>
+      <w:proofErr w:type="spellEnd"/>
+    </w:p>
+    <w:p>
+      <w:pPr>
+        <w:numPr>
+          <w:ilvl w:val="0"/>
+          <w:numId w:val="29"/>
+        </w:numPr>
+        <w:spacing w:after="0"/>
+      </w:pPr>
+      <w:r>
+        <w:t xml:space="preserve">Συνδέσου στη βάση σου (π.χ. </w:t>
+      </w:r>
+      <w:proofErr w:type="spellStart"/>
+      <w:r>
+        <w:t>Local</w:t>
+      </w:r>
+      <w:proofErr w:type="spellEnd"/>
+      <w:r>
+        <w:t xml:space="preserve"> </w:t>
+      </w:r>
+      <w:proofErr w:type="spellStart"/>
+      <w:r>
+        <w:t>MySQL</w:t>
+      </w:r>
+      <w:proofErr w:type="spellEnd"/>
+      <w:r>
+        <w:t>).</w:t>
+      </w:r>
+    </w:p>
+    <w:p>
+      <w:pPr>
+        <w:numPr>
+          <w:ilvl w:val="0"/>
+          <w:numId w:val="29"/>
+        </w:numPr>
+        <w:spacing w:after="0"/>
+      </w:pPr>
+      <w:r>
+        <w:t xml:space="preserve">Στο αριστερό </w:t>
+      </w:r>
+      <w:proofErr w:type="spellStart"/>
+      <w:r>
+        <w:t>panel</w:t>
+      </w:r>
+      <w:proofErr w:type="spellEnd"/>
+      <w:r>
+        <w:t xml:space="preserve"> άνοιξε</w:t>
+      </w:r>
+      <w:r>
+        <w:t xml:space="preserve"> </w:t>
+      </w:r>
+      <w:proofErr w:type="spellStart"/>
+      <w:r>
+        <w:t>Schemas</w:t>
+      </w:r>
+      <w:proofErr w:type="spellEnd"/>
+    </w:p>
+    <w:p>
+      <w:pPr>
+        <w:numPr>
+          <w:ilvl w:val="0"/>
+          <w:numId w:val="29"/>
+        </w:numPr>
+        <w:spacing w:after="0"/>
+      </w:pPr>
+      <w:r>
+        <w:t>Μετά άνοιξε τη βάση</w:t>
+      </w:r>
+      <w:r>
+        <w:t xml:space="preserve"> </w:t>
+      </w:r>
+      <w:r>
+        <w:t>GDPR</w:t>
+      </w:r>
+    </w:p>
+    <w:p>
+      <w:pPr>
+        <w:numPr>
+          <w:ilvl w:val="0"/>
+          <w:numId w:val="29"/>
+        </w:numPr>
+        <w:spacing w:after="0"/>
+      </w:pPr>
+      <w:r>
+        <w:t>Άνοιξε</w:t>
+      </w:r>
+      <w:r>
+        <w:t xml:space="preserve"> </w:t>
+      </w:r>
+      <w:proofErr w:type="spellStart"/>
+      <w:r>
+        <w:t>Tables</w:t>
+      </w:r>
+      <w:proofErr w:type="spellEnd"/>
+    </w:p>
+    <w:p>
+      <w:pPr>
+        <w:numPr>
+          <w:ilvl w:val="0"/>
+          <w:numId w:val="29"/>
+        </w:numPr>
+        <w:spacing w:after="0"/>
+      </w:pPr>
+      <w:r>
+        <w:t>Θα δεις έναν πίνακα</w:t>
+      </w:r>
+      <w:r>
+        <w:t xml:space="preserve"> </w:t>
+      </w:r>
+      <w:proofErr w:type="spellStart"/>
+      <w:r>
+        <w:t>accounts_appuser</w:t>
+      </w:r>
+      <w:proofErr w:type="spellEnd"/>
+    </w:p>
+    <w:p>
+      <w:pPr>
+        <w:numPr>
+          <w:ilvl w:val="0"/>
+          <w:numId w:val="29"/>
+        </w:numPr>
+        <w:spacing w:after="0"/>
+      </w:pPr>
+      <w:r>
+        <w:t xml:space="preserve">Δεξί κλικ → </w:t>
+      </w:r>
+      <w:proofErr w:type="spellStart"/>
+      <w:r>
+        <w:t>Select</w:t>
+      </w:r>
+      <w:proofErr w:type="spellEnd"/>
+      <w:r>
+        <w:t xml:space="preserve"> </w:t>
+      </w:r>
+      <w:proofErr w:type="spellStart"/>
+      <w:r>
+        <w:t>Rows</w:t>
+      </w:r>
+      <w:proofErr w:type="spellEnd"/>
+      <w:r>
+        <w:t xml:space="preserve"> → </w:t>
+      </w:r>
+      <w:proofErr w:type="spellStart"/>
+      <w:r>
+        <w:t>Limit</w:t>
+      </w:r>
+      <w:proofErr w:type="spellEnd"/>
+      <w:r>
+        <w:t xml:space="preserve"> 1000</w:t>
+      </w:r>
+    </w:p>
+    <w:p>
+      <w:pPr>
+        <w:tabs>
+          <w:tab w:val="num" w:pos="720"/>
+        </w:tabs>
+        <w:spacing w:after="0"/>
+        <w:rPr>
+          <w:lang w:val="en-US"/>
+        </w:rPr>
+      </w:pPr>
+    </w:p>
+    <w:p>
+      <w:pPr>
+        <w:tabs>
+          <w:tab w:val="num" w:pos="720"/>
+        </w:tabs>
+        <w:spacing w:after="0"/>
+      </w:pPr>
+      <w:r>
+        <w:t xml:space="preserve">Αλλιώς μπορείς να το δεις γράφοντας το εξής </w:t>
+      </w:r>
+      <w:r>
+        <w:rPr>
+          <w:lang w:val="en-US"/>
+        </w:rPr>
+        <w:t>query</w:t>
+      </w:r>
+      <w:r>
+        <w:t>:</w:t>
+      </w:r>
+    </w:p>
+    <w:p>
+      <w:pPr>
+        <w:tabs>
+          <w:tab w:val="num" w:pos="720"/>
+        </w:tabs>
+        <w:spacing w:after="0"/>
+      </w:pPr>
+      <w:r>
+        <w:rPr>
+          <w:lang w:val="en-US"/>
+        </w:rPr>
+        <w:t>USE GDPR;</w:t>
+      </w:r>
+      <w:r>
+        <w:rPr>
+          <w:lang w:val="en-US"/>
+        </w:rPr>
+        <w:br/>
+        <w:t xml:space="preserve">SELECT * FROM </w:t>
+      </w:r>
+      <w:proofErr w:type="spellStart"/>
+      <w:r>
+        <w:rPr>
+          <w:lang w:val="en-US"/>
+        </w:rPr>
+        <w:t>accounts_</w:t>
+      </w:r>
+      <w:proofErr w:type="gramStart"/>
+      <w:r>
+        <w:rPr>
+          <w:lang w:val="en-US"/>
+        </w:rPr>
+        <w:t>appuser</w:t>
+      </w:r>
+      <w:proofErr w:type="spellEnd"/>
+      <w:r>
+        <w:rPr>
+          <w:lang w:val="en-US"/>
+        </w:rPr>
+        <w:t>;</w:t>
+      </w:r>
+      <w:proofErr w:type="gramEnd"/>
+    </w:p>
+    <w:p>
+      <w:pPr>
+        <w:tabs>
+          <w:tab w:val="num" w:pos="720"/>
+        </w:tabs>
+        <w:spacing w:after="0"/>
+      </w:pPr>
+    </w:p>
+    <w:p>
+      <w:pPr>
+        <w:tabs>
+          <w:tab w:val="num" w:pos="720"/>
+        </w:tabs>
+        <w:spacing w:after="0"/>
+        <w:rPr>
+          <w:lang w:val="en-US"/>
+        </w:rPr>
+      </w:pPr>
+      <w:r>
+        <w:t xml:space="preserve">Ο χρήστης παραμένει ακόμα και αν κλείσουμε τον </w:t>
+      </w:r>
+      <w:r>
+        <w:rPr>
+          <w:lang w:val="en-US"/>
+        </w:rPr>
+        <w:t>Django</w:t>
+      </w:r>
+      <w:r>
+        <w:t xml:space="preserve"> </w:t>
+      </w:r>
+      <w:r>
+        <w:rPr>
+          <w:lang w:val="en-US"/>
+        </w:rPr>
+        <w:t>server</w:t>
+      </w:r>
+      <w:r>
+        <w:t>.</w:t>
+      </w:r>
+    </w:p>
+    <w:p>
+      <w:pPr>
+        <w:tabs>
+          <w:tab w:val="num" w:pos="720"/>
+        </w:tabs>
+        <w:spacing w:after="0"/>
+      </w:pPr>
+      <w:r>
+        <w:t>Για να διαγράψεις έναν χρήστη από την βάση, κάνεις το εξής:</w:t>
+      </w:r>
+    </w:p>
+    <w:p>
+      <w:pPr>
+        <w:numPr>
+          <w:ilvl w:val="0"/>
+          <w:numId w:val="33"/>
+        </w:numPr>
+        <w:spacing w:after="0"/>
+      </w:pPr>
+      <w:r>
+        <w:t xml:space="preserve">Άνοιξε </w:t>
+      </w:r>
+      <w:proofErr w:type="spellStart"/>
+      <w:r>
+        <w:t>MySQL</w:t>
+      </w:r>
+      <w:proofErr w:type="spellEnd"/>
+      <w:r>
+        <w:t xml:space="preserve"> </w:t>
+      </w:r>
+      <w:proofErr w:type="spellStart"/>
+      <w:r>
+        <w:t>Workbench</w:t>
+      </w:r>
+      <w:proofErr w:type="spellEnd"/>
+    </w:p>
+    <w:p>
+      <w:pPr>
+        <w:numPr>
+          <w:ilvl w:val="0"/>
+          <w:numId w:val="33"/>
+        </w:numPr>
+        <w:spacing w:after="0"/>
+      </w:pPr>
+      <w:r>
+        <w:t>Πήγαινε</w:t>
+      </w:r>
+      <w:r>
+        <w:t xml:space="preserve"> </w:t>
+      </w:r>
+      <w:r>
+        <w:t xml:space="preserve">Schemas → GDPR → Tables → </w:t>
+      </w:r>
+      <w:proofErr w:type="spellStart"/>
+      <w:r>
+        <w:t>accounts_appuser</w:t>
+      </w:r>
+      <w:proofErr w:type="spellEnd"/>
+    </w:p>
+    <w:p>
+      <w:pPr>
+        <w:numPr>
+          <w:ilvl w:val="0"/>
+          <w:numId w:val="34"/>
+        </w:numPr>
+        <w:spacing w:after="0"/>
+      </w:pPr>
+      <w:r>
+        <w:lastRenderedPageBreak/>
+        <w:t>Δεξί κλικ</w:t>
+      </w:r>
+      <w:r>
+        <w:t xml:space="preserve"> </w:t>
+      </w:r>
+      <w:proofErr w:type="spellStart"/>
+      <w:r>
+        <w:t>Select</w:t>
+      </w:r>
+      <w:proofErr w:type="spellEnd"/>
+      <w:r>
+        <w:t xml:space="preserve"> </w:t>
+      </w:r>
+      <w:proofErr w:type="spellStart"/>
+      <w:r>
+        <w:t>Rows</w:t>
+      </w:r>
+      <w:proofErr w:type="spellEnd"/>
+    </w:p>
+    <w:p>
+      <w:pPr>
+        <w:numPr>
+          <w:ilvl w:val="0"/>
+          <w:numId w:val="35"/>
+        </w:numPr>
+        <w:spacing w:after="0"/>
+      </w:pPr>
+      <w:r>
+        <w:t>Διάλεξε τη γραμμή του χρήστη</w:t>
+      </w:r>
+    </w:p>
+    <w:p>
+      <w:pPr>
+        <w:numPr>
+          <w:ilvl w:val="0"/>
+          <w:numId w:val="35"/>
+        </w:numPr>
+        <w:spacing w:after="0"/>
+      </w:pPr>
+      <w:r>
+        <w:t xml:space="preserve">Πάτα το </w:t>
+      </w:r>
+      <w:proofErr w:type="spellStart"/>
+      <w:r>
+        <w:t>delete</w:t>
+      </w:r>
+      <w:proofErr w:type="spellEnd"/>
+      <w:r>
+        <w:t xml:space="preserve"> </w:t>
+      </w:r>
+      <w:proofErr w:type="spellStart"/>
+      <w:r>
+        <w:t>icon</w:t>
+      </w:r>
+      <w:proofErr w:type="spellEnd"/>
+      <w:r>
+        <w:t xml:space="preserve"> ή δεξί κλικ → </w:t>
+      </w:r>
+      <w:proofErr w:type="spellStart"/>
+      <w:r>
+        <w:t>delete</w:t>
+      </w:r>
+      <w:proofErr w:type="spellEnd"/>
+      <w:r>
+        <w:t xml:space="preserve"> </w:t>
+      </w:r>
+      <w:proofErr w:type="spellStart"/>
+      <w:r>
+        <w:t>row</w:t>
+      </w:r>
+      <w:proofErr w:type="spellEnd"/>
+      <w:r>
+        <w:t>.</w:t>
+      </w:r>
+    </w:p>
+    <w:p>
+      <w:pPr>
+        <w:numPr>
+          <w:ilvl w:val="0"/>
+          <w:numId w:val="35"/>
+        </w:numPr>
+        <w:spacing w:after="0"/>
+      </w:pPr>
+      <w:r>
+        <w:t xml:space="preserve">Πάτα </w:t>
+      </w:r>
+      <w:proofErr w:type="spellStart"/>
+      <w:r>
+        <w:t>Apply</w:t>
       </w:r>
       <w:proofErr w:type="spellEnd"/>
       <w:r>
@@ -3455,6 +4339,119 @@
     </w:lvl>
   </w:abstractNum>
   <w:abstractNum w:abstractNumId="1" w15:restartNumberingAfterBreak="0">
+    <w:nsid w:val="07C6623D"/>
+    <w:multiLevelType w:val="multilevel"/>
+    <w:tmpl w:val="FB546F16"/>
+    <w:lvl w:ilvl="0">
+      <w:start w:val="3"/>
+      <w:numFmt w:val="decimal"/>
+      <w:lvlText w:val="%1."/>
+      <w:lvlJc w:val="left"/>
+      <w:pPr>
+        <w:tabs>
+          <w:tab w:val="num" w:pos="720"/>
+        </w:tabs>
+        <w:ind w:left="720" w:hanging="360"/>
+      </w:pPr>
+    </w:lvl>
+    <w:lvl w:ilvl="1" w:tentative="1">
+      <w:start w:val="1"/>
+      <w:numFmt w:val="decimal"/>
+      <w:lvlText w:val="%2."/>
+      <w:lvlJc w:val="left"/>
+      <w:pPr>
+        <w:tabs>
+          <w:tab w:val="num" w:pos="1440"/>
+        </w:tabs>
+        <w:ind w:left="1440" w:hanging="360"/>
+      </w:pPr>
+    </w:lvl>
+    <w:lvl w:ilvl="2" w:tentative="1">
+      <w:start w:val="1"/>
+      <w:numFmt w:val="decimal"/>
+      <w:lvlText w:val="%3."/>
+      <w:lvlJc w:val="left"/>
+      <w:pPr>
+        <w:tabs>
+          <w:tab w:val="num" w:pos="2160"/>
+        </w:tabs>
+        <w:ind w:left="2160" w:hanging="360"/>
+      </w:pPr>
+    </w:lvl>
+    <w:lvl w:ilvl="3" w:tentative="1">
+      <w:start w:val="1"/>
+      <w:numFmt w:val="decimal"/>
+      <w:lvlText w:val="%4."/>
+      <w:lvlJc w:val="left"/>
+      <w:pPr>
+        <w:tabs>
+          <w:tab w:val="num" w:pos="2880"/>
+        </w:tabs>
+        <w:ind w:left="2880" w:hanging="360"/>
+      </w:pPr>
+    </w:lvl>
+    <w:lvl w:ilvl="4" w:tentative="1">
+      <w:start w:val="1"/>
+      <w:numFmt w:val="decimal"/>
+      <w:lvlText w:val="%5."/>
+      <w:lvlJc w:val="left"/>
+      <w:pPr>
+        <w:tabs>
+          <w:tab w:val="num" w:pos="3600"/>
+        </w:tabs>
+        <w:ind w:left="3600" w:hanging="360"/>
+      </w:pPr>
+    </w:lvl>
+    <w:lvl w:ilvl="5" w:tentative="1">
+      <w:start w:val="1"/>
+      <w:numFmt w:val="decimal"/>
+      <w:lvlText w:val="%6."/>
+      <w:lvlJc w:val="left"/>
+      <w:pPr>
+        <w:tabs>
+          <w:tab w:val="num" w:pos="4320"/>
+        </w:tabs>
+        <w:ind w:left="4320" w:hanging="360"/>
+      </w:pPr>
+    </w:lvl>
+    <w:lvl w:ilvl="6" w:tentative="1">
+      <w:start w:val="1"/>
+      <w:numFmt w:val="decimal"/>
+      <w:lvlText w:val="%7."/>
+      <w:lvlJc w:val="left"/>
+      <w:pPr>
+        <w:tabs>
+          <w:tab w:val="num" w:pos="5040"/>
+        </w:tabs>
+        <w:ind w:left="5040" w:hanging="360"/>
+      </w:pPr>
+    </w:lvl>
+    <w:lvl w:ilvl="7" w:tentative="1">
+      <w:start w:val="1"/>
+      <w:numFmt w:val="decimal"/>
+      <w:lvlText w:val="%8."/>
+      <w:lvlJc w:val="left"/>
+      <w:pPr>
+        <w:tabs>
+          <w:tab w:val="num" w:pos="5760"/>
+        </w:tabs>
+        <w:ind w:left="5760" w:hanging="360"/>
+      </w:pPr>
+    </w:lvl>
+    <w:lvl w:ilvl="8" w:tentative="1">
+      <w:start w:val="1"/>
+      <w:numFmt w:val="decimal"/>
+      <w:lvlText w:val="%9."/>
+      <w:lvlJc w:val="left"/>
+      <w:pPr>
+        <w:tabs>
+          <w:tab w:val="num" w:pos="6480"/>
+        </w:tabs>
+        <w:ind w:left="6480" w:hanging="360"/>
+      </w:pPr>
+    </w:lvl>
+  </w:abstractNum>
+  <w:abstractNum w:abstractNumId="2" w15:restartNumberingAfterBreak="0">
     <w:nsid w:val="09FE1397"/>
     <w:multiLevelType w:val="multilevel"/>
     <w:tmpl w:val="927E5012"/>
@@ -3603,7 +4600,7 @@
       </w:rPr>
     </w:lvl>
   </w:abstractNum>
-  <w:abstractNum w:abstractNumId="2" w15:restartNumberingAfterBreak="0">
+  <w:abstractNum w:abstractNumId="3" w15:restartNumberingAfterBreak="0">
     <w:nsid w:val="10AC5B30"/>
     <w:multiLevelType w:val="multilevel"/>
     <w:tmpl w:val="18B06AF0"/>
@@ -3752,7 +4749,7 @@
       </w:rPr>
     </w:lvl>
   </w:abstractNum>
-  <w:abstractNum w:abstractNumId="3" w15:restartNumberingAfterBreak="0">
+  <w:abstractNum w:abstractNumId="4" w15:restartNumberingAfterBreak="0">
     <w:nsid w:val="136F4D5C"/>
     <w:multiLevelType w:val="multilevel"/>
     <w:tmpl w:val="25349E74"/>
@@ -3901,7 +4898,7 @@
       </w:rPr>
     </w:lvl>
   </w:abstractNum>
-  <w:abstractNum w:abstractNumId="4" w15:restartNumberingAfterBreak="0">
+  <w:abstractNum w:abstractNumId="5" w15:restartNumberingAfterBreak="0">
     <w:nsid w:val="15B205D2"/>
     <w:multiLevelType w:val="multilevel"/>
     <w:tmpl w:val="E676BA10"/>
@@ -4050,7 +5047,7 @@
       </w:rPr>
     </w:lvl>
   </w:abstractNum>
-  <w:abstractNum w:abstractNumId="5" w15:restartNumberingAfterBreak="0">
+  <w:abstractNum w:abstractNumId="6" w15:restartNumberingAfterBreak="0">
     <w:nsid w:val="1A4168FF"/>
     <w:multiLevelType w:val="multilevel"/>
     <w:tmpl w:val="7CD8FF08"/>
@@ -4199,7 +5196,7 @@
       </w:rPr>
     </w:lvl>
   </w:abstractNum>
-  <w:abstractNum w:abstractNumId="6" w15:restartNumberingAfterBreak="0">
+  <w:abstractNum w:abstractNumId="7" w15:restartNumberingAfterBreak="0">
     <w:nsid w:val="1C6E6ADB"/>
     <w:multiLevelType w:val="hybridMultilevel"/>
     <w:tmpl w:val="0E7AAA14"/>
@@ -4288,7 +5285,7 @@
       </w:pPr>
     </w:lvl>
   </w:abstractNum>
-  <w:abstractNum w:abstractNumId="7" w15:restartNumberingAfterBreak="0">
+  <w:abstractNum w:abstractNumId="8" w15:restartNumberingAfterBreak="0">
     <w:nsid w:val="228045B8"/>
     <w:multiLevelType w:val="multilevel"/>
     <w:tmpl w:val="B148BA74"/>
@@ -4437,7 +5434,7 @@
       </w:rPr>
     </w:lvl>
   </w:abstractNum>
-  <w:abstractNum w:abstractNumId="8" w15:restartNumberingAfterBreak="0">
+  <w:abstractNum w:abstractNumId="9" w15:restartNumberingAfterBreak="0">
     <w:nsid w:val="2B9C3966"/>
     <w:multiLevelType w:val="hybridMultilevel"/>
     <w:tmpl w:val="823E0CCE"/>
@@ -4550,7 +5547,7 @@
       </w:rPr>
     </w:lvl>
   </w:abstractNum>
-  <w:abstractNum w:abstractNumId="9" w15:restartNumberingAfterBreak="0">
+  <w:abstractNum w:abstractNumId="10" w15:restartNumberingAfterBreak="0">
     <w:nsid w:val="2C4216F8"/>
     <w:multiLevelType w:val="multilevel"/>
     <w:tmpl w:val="AF62E3A0"/>
@@ -4699,7 +5696,120 @@
       </w:rPr>
     </w:lvl>
   </w:abstractNum>
-  <w:abstractNum w:abstractNumId="10" w15:restartNumberingAfterBreak="0">
+  <w:abstractNum w:abstractNumId="11" w15:restartNumberingAfterBreak="0">
+    <w:nsid w:val="2FF75BE5"/>
+    <w:multiLevelType w:val="multilevel"/>
+    <w:tmpl w:val="3F505ABE"/>
+    <w:lvl w:ilvl="0">
+      <w:start w:val="1"/>
+      <w:numFmt w:val="decimal"/>
+      <w:lvlText w:val="%1."/>
+      <w:lvlJc w:val="left"/>
+      <w:pPr>
+        <w:tabs>
+          <w:tab w:val="num" w:pos="720"/>
+        </w:tabs>
+        <w:ind w:left="720" w:hanging="360"/>
+      </w:pPr>
+    </w:lvl>
+    <w:lvl w:ilvl="1" w:tentative="1">
+      <w:start w:val="1"/>
+      <w:numFmt w:val="decimal"/>
+      <w:lvlText w:val="%2."/>
+      <w:lvlJc w:val="left"/>
+      <w:pPr>
+        <w:tabs>
+          <w:tab w:val="num" w:pos="1440"/>
+        </w:tabs>
+        <w:ind w:left="1440" w:hanging="360"/>
+      </w:pPr>
+    </w:lvl>
+    <w:lvl w:ilvl="2" w:tentative="1">
+      <w:start w:val="1"/>
+      <w:numFmt w:val="decimal"/>
+      <w:lvlText w:val="%3."/>
+      <w:lvlJc w:val="left"/>
+      <w:pPr>
+        <w:tabs>
+          <w:tab w:val="num" w:pos="2160"/>
+        </w:tabs>
+        <w:ind w:left="2160" w:hanging="360"/>
+      </w:pPr>
+    </w:lvl>
+    <w:lvl w:ilvl="3" w:tentative="1">
+      <w:start w:val="1"/>
+      <w:numFmt w:val="decimal"/>
+      <w:lvlText w:val="%4."/>
+      <w:lvlJc w:val="left"/>
+      <w:pPr>
+        <w:tabs>
+          <w:tab w:val="num" w:pos="2880"/>
+        </w:tabs>
+        <w:ind w:left="2880" w:hanging="360"/>
+      </w:pPr>
+    </w:lvl>
+    <w:lvl w:ilvl="4" w:tentative="1">
+      <w:start w:val="1"/>
+      <w:numFmt w:val="decimal"/>
+      <w:lvlText w:val="%5."/>
+      <w:lvlJc w:val="left"/>
+      <w:pPr>
+        <w:tabs>
+          <w:tab w:val="num" w:pos="3600"/>
+        </w:tabs>
+        <w:ind w:left="3600" w:hanging="360"/>
+      </w:pPr>
+    </w:lvl>
+    <w:lvl w:ilvl="5" w:tentative="1">
+      <w:start w:val="1"/>
+      <w:numFmt w:val="decimal"/>
+      <w:lvlText w:val="%6."/>
+      <w:lvlJc w:val="left"/>
+      <w:pPr>
+        <w:tabs>
+          <w:tab w:val="num" w:pos="4320"/>
+        </w:tabs>
+        <w:ind w:left="4320" w:hanging="360"/>
+      </w:pPr>
+    </w:lvl>
+    <w:lvl w:ilvl="6" w:tentative="1">
+      <w:start w:val="1"/>
+      <w:numFmt w:val="decimal"/>
+      <w:lvlText w:val="%7."/>
+      <w:lvlJc w:val="left"/>
+      <w:pPr>
+        <w:tabs>
+          <w:tab w:val="num" w:pos="5040"/>
+        </w:tabs>
+        <w:ind w:left="5040" w:hanging="360"/>
+      </w:pPr>
+    </w:lvl>
+    <w:lvl w:ilvl="7" w:tentative="1">
+      <w:start w:val="1"/>
+      <w:numFmt w:val="decimal"/>
+      <w:lvlText w:val="%8."/>
+      <w:lvlJc w:val="left"/>
+      <w:pPr>
+        <w:tabs>
+          <w:tab w:val="num" w:pos="5760"/>
+        </w:tabs>
+        <w:ind w:left="5760" w:hanging="360"/>
+      </w:pPr>
+    </w:lvl>
+    <w:lvl w:ilvl="8" w:tentative="1">
+      <w:start w:val="1"/>
+      <w:numFmt w:val="decimal"/>
+      <w:lvlText w:val="%9."/>
+      <w:lvlJc w:val="left"/>
+      <w:pPr>
+        <w:tabs>
+          <w:tab w:val="num" w:pos="6480"/>
+        </w:tabs>
+        <w:ind w:left="6480" w:hanging="360"/>
+      </w:pPr>
+    </w:lvl>
+  </w:abstractNum>
+  <w:abstractNum w:abstractNumId="12" w15:restartNumberingAfterBreak="0">
     <w:nsid w:val="335E5977"/>
     <w:multiLevelType w:val="multilevel"/>
     <w:tmpl w:val="D02002A4"/>
@@ -4848,7 +5958,233 @@
       </w:rPr>
     </w:lvl>
   </w:abstractNum>
-  <w:abstractNum w:abstractNumId="11" w15:restartNumberingAfterBreak="0">
+  <w:abstractNum w:abstractNumId="13" w15:restartNumberingAfterBreak="0">
+    <w:nsid w:val="347E0D6B"/>
+    <w:multiLevelType w:val="multilevel"/>
+    <w:tmpl w:val="07BE7F02"/>
+    <w:lvl w:ilvl="0">
+      <w:start w:val="5"/>
+      <w:numFmt w:val="decimal"/>
+      <w:lvlText w:val="%1."/>
+      <w:lvlJc w:val="left"/>
+      <w:pPr>
+        <w:tabs>
+          <w:tab w:val="num" w:pos="720"/>
+        </w:tabs>
+        <w:ind w:left="720" w:hanging="360"/>
+      </w:pPr>
+    </w:lvl>
+    <w:lvl w:ilvl="1" w:tentative="1">
+      <w:start w:val="1"/>
+      <w:numFmt w:val="decimal"/>
+      <w:lvlText w:val="%2."/>
+      <w:lvlJc w:val="left"/>
+      <w:pPr>
+        <w:tabs>
+          <w:tab w:val="num" w:pos="1440"/>
+        </w:tabs>
+        <w:ind w:left="1440" w:hanging="360"/>
+      </w:pPr>
+    </w:lvl>
+    <w:lvl w:ilvl="2" w:tentative="1">
+      <w:start w:val="1"/>
+      <w:numFmt w:val="decimal"/>
+      <w:lvlText w:val="%3."/>
+      <w:lvlJc w:val="left"/>
+      <w:pPr>
+        <w:tabs>
+          <w:tab w:val="num" w:pos="2160"/>
+        </w:tabs>
+        <w:ind w:left="2160" w:hanging="360"/>
+      </w:pPr>
+    </w:lvl>
+    <w:lvl w:ilvl="3" w:tentative="1">
+      <w:start w:val="1"/>
+      <w:numFmt w:val="decimal"/>
+      <w:lvlText w:val="%4."/>
+      <w:lvlJc w:val="left"/>
+      <w:pPr>
+        <w:tabs>
+          <w:tab w:val="num" w:pos="2880"/>
+        </w:tabs>
+        <w:ind w:left="2880" w:hanging="360"/>
+      </w:pPr>
+    </w:lvl>
+    <w:lvl w:ilvl="4" w:tentative="1">
+      <w:start w:val="1"/>
+      <w:numFmt w:val="decimal"/>
+      <w:lvlText w:val="%5."/>
+      <w:lvlJc w:val="left"/>
+      <w:pPr>
+        <w:tabs>
+          <w:tab w:val="num" w:pos="3600"/>
+        </w:tabs>
+        <w:ind w:left="3600" w:hanging="360"/>
+      </w:pPr>
+    </w:lvl>
+    <w:lvl w:ilvl="5" w:tentative="1">
+      <w:start w:val="1"/>
+      <w:numFmt w:val="decimal"/>
+      <w:lvlText w:val="%6."/>
+      <w:lvlJc w:val="left"/>
+      <w:pPr>
+        <w:tabs>
+          <w:tab w:val="num" w:pos="4320"/>
+        </w:tabs>
+        <w:ind w:left="4320" w:hanging="360"/>
+      </w:pPr>
+    </w:lvl>
+    <w:lvl w:ilvl="6" w:tentative="1">
+      <w:start w:val="1"/>
+      <w:numFmt w:val="decimal"/>
+      <w:lvlText w:val="%7."/>
+      <w:lvlJc w:val="left"/>
+      <w:pPr>
+        <w:tabs>
+          <w:tab w:val="num" w:pos="5040"/>
+        </w:tabs>
+        <w:ind w:left="5040" w:hanging="360"/>
+      </w:pPr>
+    </w:lvl>
+    <w:lvl w:ilvl="7" w:tentative="1">
+      <w:start w:val="1"/>
+      <w:numFmt w:val="decimal"/>
+      <w:lvlText w:val="%8."/>
+      <w:lvlJc w:val="left"/>
+      <w:pPr>
+        <w:tabs>
+          <w:tab w:val="num" w:pos="5760"/>
+        </w:tabs>
+        <w:ind w:left="5760" w:hanging="360"/>
+      </w:pPr>
+    </w:lvl>
+    <w:lvl w:ilvl="8" w:tentative="1">
+      <w:start w:val="1"/>
+      <w:numFmt w:val="decimal"/>
+      <w:lvlText w:val="%9."/>
+      <w:lvlJc w:val="left"/>
+      <w:pPr>
+        <w:tabs>
+          <w:tab w:val="num" w:pos="6480"/>
+        </w:tabs>
+        <w:ind w:left="6480" w:hanging="360"/>
+      </w:pPr>
+    </w:lvl>
+  </w:abstractNum>
+  <w:abstractNum w:abstractNumId="14" w15:restartNumberingAfterBreak="0">
+    <w:nsid w:val="352102CD"/>
+    <w:multiLevelType w:val="multilevel"/>
+    <w:tmpl w:val="1F0ED59C"/>
+    <w:lvl w:ilvl="0">
+      <w:start w:val="4"/>
+      <w:numFmt w:val="decimal"/>
+      <w:lvlText w:val="%1."/>
+      <w:lvlJc w:val="left"/>
+      <w:pPr>
+        <w:tabs>
+          <w:tab w:val="num" w:pos="720"/>
+        </w:tabs>
+        <w:ind w:left="720" w:hanging="360"/>
+      </w:pPr>
+    </w:lvl>
+    <w:lvl w:ilvl="1" w:tentative="1">
+      <w:start w:val="1"/>
+      <w:numFmt w:val="decimal"/>
+      <w:lvlText w:val="%2."/>
+      <w:lvlJc w:val="left"/>
+      <w:pPr>
+        <w:tabs>
+          <w:tab w:val="num" w:pos="1440"/>
+        </w:tabs>
+        <w:ind w:left="1440" w:hanging="360"/>
+      </w:pPr>
+    </w:lvl>
+    <w:lvl w:ilvl="2" w:tentative="1">
+      <w:start w:val="1"/>
+      <w:numFmt w:val="decimal"/>
+      <w:lvlText w:val="%3."/>
+      <w:lvlJc w:val="left"/>
+      <w:pPr>
+        <w:tabs>
+          <w:tab w:val="num" w:pos="2160"/>
+        </w:tabs>
+        <w:ind w:left="2160" w:hanging="360"/>
+      </w:pPr>
+    </w:lvl>
+    <w:lvl w:ilvl="3" w:tentative="1">
+      <w:start w:val="1"/>
+      <w:numFmt w:val="decimal"/>
+      <w:lvlText w:val="%4."/>
+      <w:lvlJc w:val="left"/>
+      <w:pPr>
+        <w:tabs>
+          <w:tab w:val="num" w:pos="2880"/>
+        </w:tabs>
+        <w:ind w:left="2880" w:hanging="360"/>
+      </w:pPr>
+    </w:lvl>
+    <w:lvl w:ilvl="4" w:tentative="1">
+      <w:start w:val="1"/>
+      <w:numFmt w:val="decimal"/>
+      <w:lvlText w:val="%5."/>
+      <w:lvlJc w:val="left"/>
+      <w:pPr>
+        <w:tabs>
+          <w:tab w:val="num" w:pos="3600"/>
+        </w:tabs>
+        <w:ind w:left="3600" w:hanging="360"/>
+      </w:pPr>
+    </w:lvl>
+    <w:lvl w:ilvl="5" w:tentative="1">
+      <w:start w:val="1"/>
+      <w:numFmt w:val="decimal"/>
+      <w:lvlText w:val="%6."/>
+      <w:lvlJc w:val="left"/>
+      <w:pPr>
+        <w:tabs>
+          <w:tab w:val="num" w:pos="4320"/>
+        </w:tabs>
+        <w:ind w:left="4320" w:hanging="360"/>
+      </w:pPr>
+    </w:lvl>
+    <w:lvl w:ilvl="6" w:tentative="1">
+      <w:start w:val="1"/>
+      <w:numFmt w:val="decimal"/>
+      <w:lvlText w:val="%7."/>
+      <w:lvlJc w:val="left"/>
+      <w:pPr>
+        <w:tabs>
+          <w:tab w:val="num" w:pos="5040"/>
+        </w:tabs>
+        <w:ind w:left="5040" w:hanging="360"/>
+      </w:pPr>
+    </w:lvl>
+    <w:lvl w:ilvl="7" w:tentative="1">
+      <w:start w:val="1"/>
+      <w:numFmt w:val="decimal"/>
+      <w:lvlText w:val="%8."/>
+      <w:lvlJc w:val="left"/>
+      <w:pPr>
+        <w:tabs>
+          <w:tab w:val="num" w:pos="5760"/>
+        </w:tabs>
+        <w:ind w:left="5760" w:hanging="360"/>
+      </w:pPr>
+    </w:lvl>
+    <w:lvl w:ilvl="8" w:tentative="1">
+      <w:start w:val="1"/>
+      <w:numFmt w:val="decimal"/>
+      <w:lvlText w:val="%9."/>
+      <w:lvlJc w:val="left"/>
+      <w:pPr>
+        <w:tabs>
+          <w:tab w:val="num" w:pos="6480"/>
+        </w:tabs>
+        <w:ind w:left="6480" w:hanging="360"/>
+      </w:pPr>
+    </w:lvl>
+  </w:abstractNum>
+  <w:abstractNum w:abstractNumId="15" w15:restartNumberingAfterBreak="0">
     <w:nsid w:val="3AB312F9"/>
     <w:multiLevelType w:val="multilevel"/>
     <w:tmpl w:val="373AFFA2"/>
@@ -4997,7 +6333,7 @@
       </w:rPr>
     </w:lvl>
   </w:abstractNum>
-  <w:abstractNum w:abstractNumId="12" w15:restartNumberingAfterBreak="0">
+  <w:abstractNum w:abstractNumId="16" w15:restartNumberingAfterBreak="0">
     <w:nsid w:val="3BE80690"/>
     <w:multiLevelType w:val="multilevel"/>
     <w:tmpl w:val="D73A804C"/>
@@ -5146,7 +6482,7 @@
       </w:rPr>
     </w:lvl>
   </w:abstractNum>
-  <w:abstractNum w:abstractNumId="13" w15:restartNumberingAfterBreak="0">
+  <w:abstractNum w:abstractNumId="17" w15:restartNumberingAfterBreak="0">
     <w:nsid w:val="3E0B7CB1"/>
     <w:multiLevelType w:val="multilevel"/>
     <w:tmpl w:val="EBD020EE"/>
@@ -5295,7 +6631,7 @@
       </w:rPr>
     </w:lvl>
   </w:abstractNum>
-  <w:abstractNum w:abstractNumId="14" w15:restartNumberingAfterBreak="0">
+  <w:abstractNum w:abstractNumId="18" w15:restartNumberingAfterBreak="0">
     <w:nsid w:val="3F376691"/>
     <w:multiLevelType w:val="multilevel"/>
     <w:tmpl w:val="448CFCCC"/>
@@ -5444,7 +6780,209 @@
       </w:rPr>
     </w:lvl>
   </w:abstractNum>
-  <w:abstractNum w:abstractNumId="15" w15:restartNumberingAfterBreak="0">
+  <w:abstractNum w:abstractNumId="19" w15:restartNumberingAfterBreak="0">
+    <w:nsid w:val="411F7287"/>
+    <w:multiLevelType w:val="hybridMultilevel"/>
+    <w:tmpl w:val="F350C4B4"/>
+    <w:lvl w:ilvl="0" w:tplc="0408000F">
+      <w:start w:val="1"/>
+      <w:numFmt w:val="decimal"/>
+      <w:lvlText w:val="%1."/>
+      <w:lvlJc w:val="left"/>
+      <w:pPr>
+        <w:ind w:left="720" w:hanging="360"/>
+      </w:pPr>
+      <w:rPr>
+        <w:rFonts w:hint="default"/>
+      </w:rPr>
+    </w:lvl>
+    <w:lvl w:ilvl="1" w:tplc="04080019" w:tentative="1">
+      <w:start w:val="1"/>
+      <w:numFmt w:val="lowerLetter"/>
+      <w:lvlText w:val="%2."/>
+      <w:lvlJc w:val="left"/>
+      <w:pPr>
+        <w:ind w:left="1440" w:hanging="360"/>
+      </w:pPr>
+    </w:lvl>
+    <w:lvl w:ilvl="2" w:tplc="0408001B" w:tentative="1">
+      <w:start w:val="1"/>
+      <w:numFmt w:val="lowerRoman"/>
+      <w:lvlText w:val="%3."/>
+      <w:lvlJc w:val="right"/>
+      <w:pPr>
+        <w:ind w:left="2160" w:hanging="180"/>
+      </w:pPr>
+    </w:lvl>
+    <w:lvl w:ilvl="3" w:tplc="0408000F" w:tentative="1">
+      <w:start w:val="1"/>
+      <w:numFmt w:val="decimal"/>
+      <w:lvlText w:val="%4."/>
+      <w:lvlJc w:val="left"/>
+      <w:pPr>
+        <w:ind w:left="2880" w:hanging="360"/>
+      </w:pPr>
+    </w:lvl>
+    <w:lvl w:ilvl="4" w:tplc="04080019" w:tentative="1">
+      <w:start w:val="1"/>
+      <w:numFmt w:val="lowerLetter"/>
+      <w:lvlText w:val="%5."/>
+      <w:lvlJc w:val="left"/>
+      <w:pPr>
+        <w:ind w:left="3600" w:hanging="360"/>
+      </w:pPr>
+    </w:lvl>
+    <w:lvl w:ilvl="5" w:tplc="0408001B" w:tentative="1">
+      <w:start w:val="1"/>
+      <w:numFmt w:val="lowerRoman"/>
+      <w:lvlText w:val="%6."/>
+      <w:lvlJc w:val="right"/>
+      <w:pPr>
+        <w:ind w:left="4320" w:hanging="180"/>
+      </w:pPr>
+    </w:lvl>
+    <w:lvl w:ilvl="6" w:tplc="0408000F" w:tentative="1">
+      <w:start w:val="1"/>
+      <w:numFmt w:val="decimal"/>
+      <w:lvlText w:val="%7."/>
+      <w:lvlJc w:val="left"/>
+      <w:pPr>
+        <w:ind w:left="5040" w:hanging="360"/>
+      </w:pPr>
+    </w:lvl>
+    <w:lvl w:ilvl="7" w:tplc="04080019" w:tentative="1">
+      <w:start w:val="1"/>
+      <w:numFmt w:val="lowerLetter"/>
+      <w:lvlText w:val="%8."/>
+      <w:lvlJc w:val="left"/>
+      <w:pPr>
+        <w:ind w:left="5760" w:hanging="360"/>
+      </w:pPr>
+    </w:lvl>
+    <w:lvl w:ilvl="8" w:tplc="0408001B" w:tentative="1">
+      <w:start w:val="1"/>
+      <w:numFmt w:val="lowerRoman"/>
+      <w:lvlText w:val="%9."/>
+      <w:lvlJc w:val="right"/>
+      <w:pPr>
+        <w:ind w:left="6480" w:hanging="180"/>
+      </w:pPr>
+    </w:lvl>
+  </w:abstractNum>
+  <w:abstractNum w:abstractNumId="20" w15:restartNumberingAfterBreak="0">
+    <w:nsid w:val="420D3C9B"/>
+    <w:multiLevelType w:val="multilevel"/>
+    <w:tmpl w:val="AAAAB9CE"/>
+    <w:lvl w:ilvl="0">
+      <w:start w:val="4"/>
+      <w:numFmt w:val="decimal"/>
+      <w:lvlText w:val="%1."/>
+      <w:lvlJc w:val="left"/>
+      <w:pPr>
+        <w:tabs>
+          <w:tab w:val="num" w:pos="720"/>
+        </w:tabs>
+        <w:ind w:left="720" w:hanging="360"/>
+      </w:pPr>
+    </w:lvl>
+    <w:lvl w:ilvl="1" w:tentative="1">
+      <w:start w:val="1"/>
+      <w:numFmt w:val="decimal"/>
+      <w:lvlText w:val="%2."/>
+      <w:lvlJc w:val="left"/>
+      <w:pPr>
+        <w:tabs>
+          <w:tab w:val="num" w:pos="1440"/>
+        </w:tabs>
+        <w:ind w:left="1440" w:hanging="360"/>
+      </w:pPr>
+    </w:lvl>
+    <w:lvl w:ilvl="2" w:tentative="1">
+      <w:start w:val="1"/>
+      <w:numFmt w:val="decimal"/>
+      <w:lvlText w:val="%3."/>
+      <w:lvlJc w:val="left"/>
+      <w:pPr>
+        <w:tabs>
+          <w:tab w:val="num" w:pos="2160"/>
+        </w:tabs>
+        <w:ind w:left="2160" w:hanging="360"/>
+      </w:pPr>
+    </w:lvl>
+    <w:lvl w:ilvl="3" w:tentative="1">
+      <w:start w:val="1"/>
+      <w:numFmt w:val="decimal"/>
+      <w:lvlText w:val="%4."/>
+      <w:lvlJc w:val="left"/>
+      <w:pPr>
+        <w:tabs>
+          <w:tab w:val="num" w:pos="2880"/>
+        </w:tabs>
+        <w:ind w:left="2880" w:hanging="360"/>
+      </w:pPr>
+    </w:lvl>
+    <w:lvl w:ilvl="4" w:tentative="1">
+      <w:start w:val="1"/>
+      <w:numFmt w:val="decimal"/>
+      <w:lvlText w:val="%5."/>
+      <w:lvlJc w:val="left"/>
+      <w:pPr>
+        <w:tabs>
+          <w:tab w:val="num" w:pos="3600"/>
+        </w:tabs>
+        <w:ind w:left="3600" w:hanging="360"/>
+      </w:pPr>
+    </w:lvl>
+    <w:lvl w:ilvl="5" w:tentative="1">
+      <w:start w:val="1"/>
+      <w:numFmt w:val="decimal"/>
+      <w:lvlText w:val="%6."/>
+      <w:lvlJc w:val="left"/>
+      <w:pPr>
+        <w:tabs>
+          <w:tab w:val="num" w:pos="4320"/>
+        </w:tabs>
+        <w:ind w:left="4320" w:hanging="360"/>
+      </w:pPr>
+    </w:lvl>
+    <w:lvl w:ilvl="6" w:tentative="1">
+      <w:start w:val="1"/>
+      <w:numFmt w:val="decimal"/>
+      <w:lvlText w:val="%7."/>
+      <w:lvlJc w:val="left"/>
+      <w:pPr>
+        <w:tabs>
+          <w:tab w:val="num" w:pos="5040"/>
+        </w:tabs>
+        <w:ind w:left="5040" w:hanging="360"/>
+      </w:pPr>
+    </w:lvl>
+    <w:lvl w:ilvl="7" w:tentative="1">
+      <w:start w:val="1"/>
+      <w:numFmt w:val="decimal"/>
+      <w:lvlText w:val="%8."/>
+      <w:lvlJc w:val="left"/>
+      <w:pPr>
+        <w:tabs>
+          <w:tab w:val="num" w:pos="5760"/>
+        </w:tabs>
+        <w:ind w:left="5760" w:hanging="360"/>
+      </w:pPr>
+    </w:lvl>
+    <w:lvl w:ilvl="8" w:tentative="1">
+      <w:start w:val="1"/>
+      <w:numFmt w:val="decimal"/>
+      <w:lvlText w:val="%9."/>
+      <w:lvlJc w:val="left"/>
+      <w:pPr>
+        <w:tabs>
+          <w:tab w:val="num" w:pos="6480"/>
+        </w:tabs>
+        <w:ind w:left="6480" w:hanging="360"/>
+      </w:pPr>
+    </w:lvl>
+  </w:abstractNum>
+  <w:abstractNum w:abstractNumId="21" w15:restartNumberingAfterBreak="0">
     <w:nsid w:val="455D397C"/>
     <w:multiLevelType w:val="multilevel"/>
     <w:tmpl w:val="2974B04A"/>
@@ -5593,7 +7131,7 @@
       </w:rPr>
     </w:lvl>
   </w:abstractNum>
-  <w:abstractNum w:abstractNumId="16" w15:restartNumberingAfterBreak="0">
+  <w:abstractNum w:abstractNumId="22" w15:restartNumberingAfterBreak="0">
     <w:nsid w:val="4B0D7F2E"/>
     <w:multiLevelType w:val="multilevel"/>
     <w:tmpl w:val="CC126BA2"/>
@@ -5742,7 +7280,7 @@
       </w:rPr>
     </w:lvl>
   </w:abstractNum>
-  <w:abstractNum w:abstractNumId="17" w15:restartNumberingAfterBreak="0">
+  <w:abstractNum w:abstractNumId="23" w15:restartNumberingAfterBreak="0">
     <w:nsid w:val="4C867679"/>
     <w:multiLevelType w:val="multilevel"/>
     <w:tmpl w:val="81B454F2"/>
@@ -5891,7 +7429,120 @@
       </w:rPr>
     </w:lvl>
   </w:abstractNum>
-  <w:abstractNum w:abstractNumId="18" w15:restartNumberingAfterBreak="0">
+  <w:abstractNum w:abstractNumId="24" w15:restartNumberingAfterBreak="0">
+    <w:nsid w:val="4CA22A39"/>
+    <w:multiLevelType w:val="multilevel"/>
+    <w:tmpl w:val="2B8AD1DA"/>
+    <w:lvl w:ilvl="0">
+      <w:start w:val="6"/>
+      <w:numFmt w:val="decimal"/>
+      <w:lvlText w:val="%1."/>
+      <w:lvlJc w:val="left"/>
+      <w:pPr>
+        <w:tabs>
+          <w:tab w:val="num" w:pos="720"/>
+        </w:tabs>
+        <w:ind w:left="720" w:hanging="360"/>
+      </w:pPr>
+    </w:lvl>
+    <w:lvl w:ilvl="1" w:tentative="1">
+      <w:start w:val="1"/>
+      <w:numFmt w:val="decimal"/>
+      <w:lvlText w:val="%2."/>
+      <w:lvlJc w:val="left"/>
+      <w:pPr>
+        <w:tabs>
+          <w:tab w:val="num" w:pos="1440"/>
+        </w:tabs>
+        <w:ind w:left="1440" w:hanging="360"/>
+      </w:pPr>
+    </w:lvl>
+    <w:lvl w:ilvl="2" w:tentative="1">
+      <w:start w:val="1"/>
+      <w:numFmt w:val="decimal"/>
+      <w:lvlText w:val="%3."/>
+      <w:lvlJc w:val="left"/>
+      <w:pPr>
+        <w:tabs>
+          <w:tab w:val="num" w:pos="2160"/>
+        </w:tabs>
+        <w:ind w:left="2160" w:hanging="360"/>
+      </w:pPr>
+    </w:lvl>
+    <w:lvl w:ilvl="3" w:tentative="1">
+      <w:start w:val="1"/>
+      <w:numFmt w:val="decimal"/>
+      <w:lvlText w:val="%4."/>
+      <w:lvlJc w:val="left"/>
+      <w:pPr>
+        <w:tabs>
+          <w:tab w:val="num" w:pos="2880"/>
+        </w:tabs>
+        <w:ind w:left="2880" w:hanging="360"/>
+      </w:pPr>
+    </w:lvl>
+    <w:lvl w:ilvl="4" w:tentative="1">
+      <w:start w:val="1"/>
+      <w:numFmt w:val="decimal"/>
+      <w:lvlText w:val="%5."/>
+      <w:lvlJc w:val="left"/>
+      <w:pPr>
+        <w:tabs>
+          <w:tab w:val="num" w:pos="3600"/>
+        </w:tabs>
+        <w:ind w:left="3600" w:hanging="360"/>
+      </w:pPr>
+    </w:lvl>
+    <w:lvl w:ilvl="5" w:tentative="1">
+      <w:start w:val="1"/>
+      <w:numFmt w:val="decimal"/>
+      <w:lvlText w:val="%6."/>
+      <w:lvlJc w:val="left"/>
+      <w:pPr>
+        <w:tabs>
+          <w:tab w:val="num" w:pos="4320"/>
+        </w:tabs>
+        <w:ind w:left="4320" w:hanging="360"/>
+      </w:pPr>
+    </w:lvl>
+    <w:lvl w:ilvl="6" w:tentative="1">
+      <w:start w:val="1"/>
+      <w:numFmt w:val="decimal"/>
+      <w:lvlText w:val="%7."/>
+      <w:lvlJc w:val="left"/>
+      <w:pPr>
+        <w:tabs>
+          <w:tab w:val="num" w:pos="5040"/>
+        </w:tabs>
+        <w:ind w:left="5040" w:hanging="360"/>
+      </w:pPr>
+    </w:lvl>
+    <w:lvl w:ilvl="7" w:tentative="1">
+      <w:start w:val="1"/>
+      <w:numFmt w:val="decimal"/>
+      <w:lvlText w:val="%8."/>
+      <w:lvlJc w:val="left"/>
+      <w:pPr>
+        <w:tabs>
+          <w:tab w:val="num" w:pos="5760"/>
+        </w:tabs>
+        <w:ind w:left="5760" w:hanging="360"/>
+      </w:pPr>
+    </w:lvl>
+    <w:lvl w:ilvl="8" w:tentative="1">
+      <w:start w:val="1"/>
+      <w:numFmt w:val="decimal"/>
+      <w:lvlText w:val="%9."/>
+      <w:lvlJc w:val="left"/>
+      <w:pPr>
+        <w:tabs>
+          <w:tab w:val="num" w:pos="6480"/>
+        </w:tabs>
+        <w:ind w:left="6480" w:hanging="360"/>
+      </w:pPr>
+    </w:lvl>
+  </w:abstractNum>
+  <w:abstractNum w:abstractNumId="25" w15:restartNumberingAfterBreak="0">
     <w:nsid w:val="4D8125D0"/>
     <w:multiLevelType w:val="multilevel"/>
     <w:tmpl w:val="B5C27D5A"/>
@@ -6040,7 +7691,7 @@
       </w:rPr>
     </w:lvl>
   </w:abstractNum>
-  <w:abstractNum w:abstractNumId="19" w15:restartNumberingAfterBreak="0">
+  <w:abstractNum w:abstractNumId="26" w15:restartNumberingAfterBreak="0">
     <w:nsid w:val="56CB6E08"/>
     <w:multiLevelType w:val="multilevel"/>
     <w:tmpl w:val="D47E74C0"/>
@@ -6189,10 +7840,10 @@
       </w:rPr>
     </w:lvl>
   </w:abstractNum>
-  <w:abstractNum w:abstractNumId="20" w15:restartNumberingAfterBreak="0">
+  <w:abstractNum w:abstractNumId="27" w15:restartNumberingAfterBreak="0">
     <w:nsid w:val="5A54234E"/>
     <w:multiLevelType w:val="hybridMultilevel"/>
-    <w:tmpl w:val="D818B414"/>
+    <w:tmpl w:val="3684F440"/>
     <w:lvl w:ilvl="0" w:tplc="04080001">
       <w:start w:val="1"/>
       <w:numFmt w:val="bullet"/>
@@ -6302,7 +7953,7 @@
       </w:rPr>
     </w:lvl>
   </w:abstractNum>
-  <w:abstractNum w:abstractNumId="21" w15:restartNumberingAfterBreak="0">
+  <w:abstractNum w:abstractNumId="28" w15:restartNumberingAfterBreak="0">
     <w:nsid w:val="64AF602D"/>
     <w:multiLevelType w:val="hybridMultilevel"/>
     <w:tmpl w:val="3176D7C2"/>
@@ -6391,7 +8042,7 @@
       </w:pPr>
     </w:lvl>
   </w:abstractNum>
-  <w:abstractNum w:abstractNumId="22" w15:restartNumberingAfterBreak="0">
+  <w:abstractNum w:abstractNumId="29" w15:restartNumberingAfterBreak="0">
     <w:nsid w:val="689B5A12"/>
     <w:multiLevelType w:val="multilevel"/>
     <w:tmpl w:val="618E22AE"/>
@@ -6540,7 +8191,7 @@
       </w:rPr>
     </w:lvl>
   </w:abstractNum>
-  <w:abstractNum w:abstractNumId="23" w15:restartNumberingAfterBreak="0">
+  <w:abstractNum w:abstractNumId="30" w15:restartNumberingAfterBreak="0">
     <w:nsid w:val="6E674580"/>
     <w:multiLevelType w:val="multilevel"/>
     <w:tmpl w:val="0DF8321C"/>
@@ -6689,7 +8340,7 @@
       </w:rPr>
     </w:lvl>
   </w:abstractNum>
-  <w:abstractNum w:abstractNumId="24" w15:restartNumberingAfterBreak="0">
+  <w:abstractNum w:abstractNumId="31" w15:restartNumberingAfterBreak="0">
     <w:nsid w:val="76933D4C"/>
     <w:multiLevelType w:val="multilevel"/>
     <w:tmpl w:val="8528D61A"/>
@@ -6838,7 +8489,120 @@
       </w:rPr>
     </w:lvl>
   </w:abstractNum>
-  <w:abstractNum w:abstractNumId="25" w15:restartNumberingAfterBreak="0">
+  <w:abstractNum w:abstractNumId="32" w15:restartNumberingAfterBreak="0">
+    <w:nsid w:val="776A696E"/>
+    <w:multiLevelType w:val="multilevel"/>
+    <w:tmpl w:val="F9F6194E"/>
+    <w:lvl w:ilvl="0">
+      <w:start w:val="1"/>
+      <w:numFmt w:val="decimal"/>
+      <w:lvlText w:val="%1."/>
+      <w:lvlJc w:val="left"/>
+      <w:pPr>
+        <w:tabs>
+          <w:tab w:val="num" w:pos="720"/>
+        </w:tabs>
+        <w:ind w:left="720" w:hanging="360"/>
+      </w:pPr>
+    </w:lvl>
+    <w:lvl w:ilvl="1" w:tentative="1">
+      <w:start w:val="1"/>
+      <w:numFmt w:val="decimal"/>
+      <w:lvlText w:val="%2."/>
+      <w:lvlJc w:val="left"/>
+      <w:pPr>
+        <w:tabs>
+          <w:tab w:val="num" w:pos="1440"/>
+        </w:tabs>
+        <w:ind w:left="1440" w:hanging="360"/>
+      </w:pPr>
+    </w:lvl>
+    <w:lvl w:ilvl="2" w:tentative="1">
+      <w:start w:val="1"/>
+      <w:numFmt w:val="decimal"/>
+      <w:lvlText w:val="%3."/>
+      <w:lvlJc w:val="left"/>
+      <w:pPr>
+        <w:tabs>
+          <w:tab w:val="num" w:pos="2160"/>
+        </w:tabs>
+        <w:ind w:left="2160" w:hanging="360"/>
+      </w:pPr>
+    </w:lvl>
+    <w:lvl w:ilvl="3" w:tentative="1">
+      <w:start w:val="1"/>
+      <w:numFmt w:val="decimal"/>
+      <w:lvlText w:val="%4."/>
+      <w:lvlJc w:val="left"/>
+      <w:pPr>
+        <w:tabs>
+          <w:tab w:val="num" w:pos="2880"/>
+        </w:tabs>
+        <w:ind w:left="2880" w:hanging="360"/>
+      </w:pPr>
+    </w:lvl>
+    <w:lvl w:ilvl="4" w:tentative="1">
+      <w:start w:val="1"/>
+      <w:numFmt w:val="decimal"/>
+      <w:lvlText w:val="%5."/>
+      <w:lvlJc w:val="left"/>
+      <w:pPr>
+        <w:tabs>
+          <w:tab w:val="num" w:pos="3600"/>
+        </w:tabs>
+        <w:ind w:left="3600" w:hanging="360"/>
+      </w:pPr>
+    </w:lvl>
+    <w:lvl w:ilvl="5" w:tentative="1">
+      <w:start w:val="1"/>
+      <w:numFmt w:val="decimal"/>
+      <w:lvlText w:val="%6."/>
+      <w:lvlJc w:val="left"/>
+      <w:pPr>
+        <w:tabs>
+          <w:tab w:val="num" w:pos="4320"/>
+        </w:tabs>
+        <w:ind w:left="4320" w:hanging="360"/>
+      </w:pPr>
+    </w:lvl>
+    <w:lvl w:ilvl="6" w:tentative="1">
+      <w:start w:val="1"/>
+      <w:numFmt w:val="decimal"/>
+      <w:lvlText w:val="%7."/>
+      <w:lvlJc w:val="left"/>
+      <w:pPr>
+        <w:tabs>
+          <w:tab w:val="num" w:pos="5040"/>
+        </w:tabs>
+        <w:ind w:left="5040" w:hanging="360"/>
+      </w:pPr>
+    </w:lvl>
+    <w:lvl w:ilvl="7" w:tentative="1">
+      <w:start w:val="1"/>
+      <w:numFmt w:val="decimal"/>
+      <w:lvlText w:val="%8."/>
+      <w:lvlJc w:val="left"/>
+      <w:pPr>
+        <w:tabs>
+          <w:tab w:val="num" w:pos="5760"/>
+        </w:tabs>
+        <w:ind w:left="5760" w:hanging="360"/>
+      </w:pPr>
+    </w:lvl>
+    <w:lvl w:ilvl="8" w:tentative="1">
+      <w:start w:val="1"/>
+      <w:numFmt w:val="decimal"/>
+      <w:lvlText w:val="%9."/>
+      <w:lvlJc w:val="left"/>
+      <w:pPr>
+        <w:tabs>
+          <w:tab w:val="num" w:pos="6480"/>
+        </w:tabs>
+        <w:ind w:left="6480" w:hanging="360"/>
+      </w:pPr>
+    </w:lvl>
+  </w:abstractNum>
+  <w:abstractNum w:abstractNumId="33" w15:restartNumberingAfterBreak="0">
     <w:nsid w:val="7807662E"/>
     <w:multiLevelType w:val="multilevel"/>
     <w:tmpl w:val="65526FE4"/>
@@ -6987,7 +8751,7 @@
       </w:rPr>
     </w:lvl>
   </w:abstractNum>
-  <w:abstractNum w:abstractNumId="26" w15:restartNumberingAfterBreak="0">
+  <w:abstractNum w:abstractNumId="34" w15:restartNumberingAfterBreak="0">
     <w:nsid w:val="7C0A720D"/>
     <w:multiLevelType w:val="multilevel"/>
     <w:tmpl w:val="660AE7AE"/>
@@ -7137,85 +8901,109 @@
     </w:lvl>
   </w:abstractNum>
   <w:num w:numId="1" w16cid:durableId="830828936">
+    <w:abstractNumId w:val="9"/>
+  </w:num>
+  <w:num w:numId="2" w16cid:durableId="1777601694">
+    <w:abstractNumId w:val="30"/>
+  </w:num>
+  <w:num w:numId="3" w16cid:durableId="986085624">
+    <w:abstractNumId w:val="15"/>
+  </w:num>
+  <w:num w:numId="4" w16cid:durableId="295183899">
+    <w:abstractNumId w:val="2"/>
+  </w:num>
+  <w:num w:numId="5" w16cid:durableId="995493502">
     <w:abstractNumId w:val="8"/>
   </w:num>
-  <w:num w:numId="2" w16cid:durableId="1777601694">
-    <w:abstractNumId w:val="23"/>
-  </w:num>
-  <w:num w:numId="3" w16cid:durableId="986085624">
-    <w:abstractNumId w:val="11"/>
-  </w:num>
-  <w:num w:numId="4" w16cid:durableId="295183899">
-    <w:abstractNumId w:val="1"/>
-  </w:num>
-  <w:num w:numId="5" w16cid:durableId="995493502">
-    <w:abstractNumId w:val="7"/>
-  </w:num>
   <w:num w:numId="6" w16cid:durableId="1495224728">
-    <w:abstractNumId w:val="15"/>
+    <w:abstractNumId w:val="21"/>
   </w:num>
   <w:num w:numId="7" w16cid:durableId="1784230336">
     <w:abstractNumId w:val="0"/>
   </w:num>
   <w:num w:numId="8" w16cid:durableId="331295978">
+    <w:abstractNumId w:val="23"/>
+  </w:num>
+  <w:num w:numId="9" w16cid:durableId="1305620030">
+    <w:abstractNumId w:val="22"/>
+  </w:num>
+  <w:num w:numId="10" w16cid:durableId="1358962906">
     <w:abstractNumId w:val="17"/>
   </w:num>
-  <w:num w:numId="9" w16cid:durableId="1305620030">
+  <w:num w:numId="11" w16cid:durableId="1041133741">
+    <w:abstractNumId w:val="5"/>
+  </w:num>
+  <w:num w:numId="12" w16cid:durableId="130173889">
+    <w:abstractNumId w:val="33"/>
+  </w:num>
+  <w:num w:numId="13" w16cid:durableId="1490052240">
+    <w:abstractNumId w:val="34"/>
+  </w:num>
+  <w:num w:numId="14" w16cid:durableId="444008152">
+    <w:abstractNumId w:val="10"/>
+  </w:num>
+  <w:num w:numId="15" w16cid:durableId="939602951">
+    <w:abstractNumId w:val="25"/>
+  </w:num>
+  <w:num w:numId="16" w16cid:durableId="1384863813">
+    <w:abstractNumId w:val="12"/>
+  </w:num>
+  <w:num w:numId="17" w16cid:durableId="943464705">
+    <w:abstractNumId w:val="27"/>
+  </w:num>
+  <w:num w:numId="18" w16cid:durableId="1632789671">
+    <w:abstractNumId w:val="18"/>
+  </w:num>
+  <w:num w:numId="19" w16cid:durableId="934704678">
+    <w:abstractNumId w:val="4"/>
+  </w:num>
+  <w:num w:numId="20" w16cid:durableId="1504591436">
+    <w:abstractNumId w:val="28"/>
+  </w:num>
+  <w:num w:numId="21" w16cid:durableId="452942399">
+    <w:abstractNumId w:val="7"/>
+  </w:num>
+  <w:num w:numId="22" w16cid:durableId="759255251">
     <w:abstractNumId w:val="16"/>
   </w:num>
-  <w:num w:numId="10" w16cid:durableId="1358962906">
+  <w:num w:numId="23" w16cid:durableId="2039501596">
+    <w:abstractNumId w:val="29"/>
+  </w:num>
+  <w:num w:numId="24" w16cid:durableId="1373505725">
+    <w:abstractNumId w:val="6"/>
+  </w:num>
+  <w:num w:numId="25" w16cid:durableId="461847899">
+    <w:abstractNumId w:val="31"/>
+  </w:num>
+  <w:num w:numId="26" w16cid:durableId="1994411415">
+    <w:abstractNumId w:val="3"/>
+  </w:num>
+  <w:num w:numId="27" w16cid:durableId="1173104375">
+    <w:abstractNumId w:val="26"/>
+  </w:num>
+  <w:num w:numId="28" w16cid:durableId="243926305">
+    <w:abstractNumId w:val="19"/>
+  </w:num>
+  <w:num w:numId="29" w16cid:durableId="348221582">
+    <w:abstractNumId w:val="32"/>
+  </w:num>
+  <w:num w:numId="30" w16cid:durableId="1264873720">
+    <w:abstractNumId w:val="20"/>
+  </w:num>
+  <w:num w:numId="31" w16cid:durableId="1898776818">
     <w:abstractNumId w:val="13"/>
   </w:num>
-  <w:num w:numId="11" w16cid:durableId="1041133741">
-    <w:abstractNumId w:val="4"/>
-  </w:num>
-  <w:num w:numId="12" w16cid:durableId="130173889">
-    <w:abstractNumId w:val="25"/>
-  </w:num>
-  <w:num w:numId="13" w16cid:durableId="1490052240">
-    <w:abstractNumId w:val="26"/>
-  </w:num>
-  <w:num w:numId="14" w16cid:durableId="444008152">
-    <w:abstractNumId w:val="9"/>
-  </w:num>
-  <w:num w:numId="15" w16cid:durableId="939602951">
-    <w:abstractNumId w:val="18"/>
-  </w:num>
-  <w:num w:numId="16" w16cid:durableId="1384863813">
-    <w:abstractNumId w:val="10"/>
-  </w:num>
-  <w:num w:numId="17" w16cid:durableId="943464705">
-    <w:abstractNumId w:val="20"/>
-  </w:num>
-  <w:num w:numId="18" w16cid:durableId="1632789671">
-    <w:abstractNumId w:val="14"/>
-  </w:num>
-  <w:num w:numId="19" w16cid:durableId="934704678">
-    <w:abstractNumId w:val="3"/>
-  </w:num>
-  <w:num w:numId="20" w16cid:durableId="1504591436">
-    <w:abstractNumId w:val="21"/>
-  </w:num>
-  <w:num w:numId="21" w16cid:durableId="452942399">
-    <w:abstractNumId w:val="6"/>
-  </w:num>
-  <w:num w:numId="22" w16cid:durableId="759255251">
-    <w:abstractNumId w:val="12"/>
-  </w:num>
-  <w:num w:numId="23" w16cid:durableId="2039501596">
-    <w:abstractNumId w:val="22"/>
-  </w:num>
-  <w:num w:numId="24" w16cid:durableId="1373505725">
-    <w:abstractNumId w:val="5"/>
-  </w:num>
-  <w:num w:numId="25" w16cid:durableId="461847899">
+  <w:num w:numId="32" w16cid:durableId="288049475">
     <w:abstractNumId w:val="24"/>
   </w:num>
-  <w:num w:numId="26" w16cid:durableId="1994411415">
-    <w:abstractNumId w:val="2"/>
+  <w:num w:numId="33" w16cid:durableId="1678190374">
+    <w:abstractNumId w:val="11"/>
   </w:num>
-  <w:num w:numId="27" w16cid:durableId="1173104375">
-    <w:abstractNumId w:val="19"/>
+  <w:num w:numId="34" w16cid:durableId="461852227">
+    <w:abstractNumId w:val="1"/>
+  </w:num>
+  <w:num w:numId="35" w16cid:durableId="677848341">
+    <w:abstractNumId w:val="14"/>
   </w:num>
 </w:numbering>
 </file>

</xml_diff>

<commit_message>
Frontend and Backend Static Password Policy
</commit_message>
<xml_diff>
--- a/docs/Draft Notes - Olga.docx
+++ b/docs/Draft Notes - Olga.docx
@@ -1086,11 +1086,6 @@
       </w:r>
     </w:p>
     <w:p>
-      <w:pPr>
-        <w:rPr>
-          <w:lang w:val="en-US"/>
-        </w:rPr>
-      </w:pPr>
       <w:r>
         <w:t xml:space="preserve">Είναι τα </w:t>
       </w:r>
@@ -1517,7 +1512,6 @@
         <w:t xml:space="preserve">from </w:t>
       </w:r>
       <w:proofErr w:type="spellStart"/>
-      <w:proofErr w:type="gramStart"/>
       <w:r>
         <w:rPr>
           <w:i/>
@@ -1527,7 +1521,6 @@
         <w:t>django.shortcuts</w:t>
       </w:r>
       <w:proofErr w:type="spellEnd"/>
-      <w:proofErr w:type="gramEnd"/>
       <w:r>
         <w:rPr>
           <w:i/>
@@ -1578,40 +1571,66 @@
           <w:lang w:val="en-US"/>
         </w:rPr>
         <w:br/>
-        <w:t xml:space="preserve">return </w:t>
-      </w:r>
-      <w:proofErr w:type="gramStart"/>
+        <w:t>return render(request, 'index.html')</w:t>
+      </w:r>
       <w:r>
         <w:rPr>
           <w:i/>
           <w:iCs/>
           <w:lang w:val="en-US"/>
         </w:rPr>
-        <w:t>render(</w:t>
-      </w:r>
-      <w:proofErr w:type="gramEnd"/>
+        <w:br/>
+      </w:r>
       <w:r>
         <w:rPr>
           <w:i/>
           <w:iCs/>
           <w:lang w:val="en-US"/>
         </w:rPr>
-        <w:t>request, 'index.html')</w:t>
-      </w:r>
+        <w:br/>
+        <w:t xml:space="preserve">def </w:t>
+      </w:r>
+      <w:proofErr w:type="spellStart"/>
       <w:r>
         <w:rPr>
           <w:i/>
           <w:iCs/>
           <w:lang w:val="en-US"/>
         </w:rPr>
-        <w:br/>
-      </w:r>
+        <w:t>login_page</w:t>
+      </w:r>
+      <w:proofErr w:type="spellEnd"/>
       <w:r>
         <w:rPr>
           <w:i/>
           <w:iCs/>
           <w:lang w:val="en-US"/>
         </w:rPr>
+        <w:t>(request):</w:t>
+      </w:r>
+      <w:r>
+        <w:rPr>
+          <w:i/>
+          <w:iCs/>
+          <w:lang w:val="en-US"/>
+        </w:rPr>
+        <w:br/>
+        <w:t>return render(request, 'login.html')</w:t>
+      </w:r>
+      <w:r>
+        <w:rPr>
+          <w:i/>
+          <w:iCs/>
+          <w:lang w:val="en-US"/>
+        </w:rPr>
+        <w:br/>
+      </w:r>
+      <w:r>
+        <w:rPr>
+          <w:i/>
+          <w:iCs/>
+          <w:lang w:val="en-US"/>
+        </w:rPr>
         <w:br/>
         <w:t xml:space="preserve">def </w:t>
       </w:r>
@@ -1622,7 +1641,7 @@
           <w:iCs/>
           <w:lang w:val="en-US"/>
         </w:rPr>
-        <w:t>login_page</w:t>
+        <w:t>register_page</w:t>
       </w:r>
       <w:proofErr w:type="spellEnd"/>
       <w:r>
@@ -1640,87 +1659,7 @@
           <w:lang w:val="en-US"/>
         </w:rPr>
         <w:br/>
-        <w:t xml:space="preserve">return </w:t>
-      </w:r>
-      <w:proofErr w:type="gramStart"/>
-      <w:r>
-        <w:rPr>
-          <w:i/>
-          <w:iCs/>
-          <w:lang w:val="en-US"/>
-        </w:rPr>
-        <w:t>render(</w:t>
-      </w:r>
-      <w:proofErr w:type="gramEnd"/>
-      <w:r>
-        <w:rPr>
-          <w:i/>
-          <w:iCs/>
-          <w:lang w:val="en-US"/>
-        </w:rPr>
-        <w:t>request, 'login.html')</w:t>
-      </w:r>
-      <w:r>
-        <w:rPr>
-          <w:i/>
-          <w:iCs/>
-          <w:lang w:val="en-US"/>
-        </w:rPr>
-        <w:br/>
-      </w:r>
-      <w:r>
-        <w:rPr>
-          <w:i/>
-          <w:iCs/>
-          <w:lang w:val="en-US"/>
-        </w:rPr>
-        <w:br/>
-        <w:t xml:space="preserve">def </w:t>
-      </w:r>
-      <w:proofErr w:type="spellStart"/>
-      <w:r>
-        <w:rPr>
-          <w:i/>
-          <w:iCs/>
-          <w:lang w:val="en-US"/>
-        </w:rPr>
-        <w:t>register_page</w:t>
-      </w:r>
-      <w:proofErr w:type="spellEnd"/>
-      <w:r>
-        <w:rPr>
-          <w:i/>
-          <w:iCs/>
-          <w:lang w:val="en-US"/>
-        </w:rPr>
-        <w:t>(request):</w:t>
-      </w:r>
-      <w:r>
-        <w:rPr>
-          <w:i/>
-          <w:iCs/>
-          <w:lang w:val="en-US"/>
-        </w:rPr>
-        <w:br/>
-        <w:t xml:space="preserve">return </w:t>
-      </w:r>
-      <w:proofErr w:type="gramStart"/>
-      <w:r>
-        <w:rPr>
-          <w:i/>
-          <w:iCs/>
-          <w:lang w:val="en-US"/>
-        </w:rPr>
-        <w:t>render(</w:t>
-      </w:r>
-      <w:proofErr w:type="gramEnd"/>
-      <w:r>
-        <w:rPr>
-          <w:i/>
-          <w:iCs/>
-          <w:lang w:val="en-US"/>
-        </w:rPr>
-        <w:t>request, 'register.html')</w:t>
+        <w:t>return render(request, 'register.html')</w:t>
       </w:r>
     </w:p>
     <w:p>
@@ -1756,9 +1695,6 @@
         <w:tabs>
           <w:tab w:val="num" w:pos="720"/>
         </w:tabs>
-        <w:rPr>
-          <w:lang w:val="en-US"/>
-        </w:rPr>
       </w:pPr>
       <w:r>
         <w:t>Κάνει</w:t>
@@ -1978,11 +1914,6 @@
           <w:lang w:val="en-US"/>
         </w:rPr>
         <w:br/>
-      </w:r>
-      <w:r>
-        <w:rPr>
-          <w:lang w:val="en-US"/>
-        </w:rPr>
         <w:t xml:space="preserve">&lt;a </w:t>
       </w:r>
       <w:proofErr w:type="spellStart"/>
@@ -2751,9 +2682,6 @@
         <w:tabs>
           <w:tab w:val="num" w:pos="720"/>
         </w:tabs>
-        <w:rPr>
-          <w:lang w:val="en-US"/>
-        </w:rPr>
       </w:pPr>
     </w:p>
     <w:p>
@@ -3363,9 +3291,6 @@
         <w:tabs>
           <w:tab w:val="num" w:pos="720"/>
         </w:tabs>
-        <w:rPr>
-          <w:lang w:val="en-US"/>
-        </w:rPr>
       </w:pPr>
       <w:r>
         <w:t xml:space="preserve">Σταματάς τον </w:t>
@@ -3420,9 +3345,6 @@
         <w:tabs>
           <w:tab w:val="num" w:pos="720"/>
         </w:tabs>
-        <w:rPr>
-          <w:lang w:val="en-US"/>
-        </w:rPr>
       </w:pPr>
     </w:p>
     <w:p>
@@ -3483,9 +3405,12 @@
       </w:r>
       <w:proofErr w:type="spellStart"/>
       <w:r>
-        <w:t>Up.</w:t>
-      </w:r>
-      <w:proofErr w:type="spellEnd"/>
+        <w:t>Up</w:t>
+      </w:r>
+      <w:proofErr w:type="spellEnd"/>
+      <w:r>
+        <w:t>.</w:t>
+      </w:r>
     </w:p>
     <w:p>
       <w:pPr>
@@ -3511,9 +3436,12 @@
       </w:r>
       <w:proofErr w:type="spellStart"/>
       <w:r>
-        <w:t>form.</w:t>
-      </w:r>
-      <w:proofErr w:type="spellEnd"/>
+        <w:t>form</w:t>
+      </w:r>
+      <w:proofErr w:type="spellEnd"/>
+      <w:r>
+        <w:t>.</w:t>
+      </w:r>
     </w:p>
     <w:p>
       <w:pPr>
@@ -3644,7 +3572,6 @@
         <w:t xml:space="preserve">from </w:t>
       </w:r>
       <w:proofErr w:type="spellStart"/>
-      <w:proofErr w:type="gramStart"/>
       <w:r>
         <w:rPr>
           <w:lang w:val="en-US"/>
@@ -3652,7 +3579,6 @@
         <w:t>accounts.models</w:t>
       </w:r>
       <w:proofErr w:type="spellEnd"/>
-      <w:proofErr w:type="gramEnd"/>
       <w:r>
         <w:rPr>
           <w:lang w:val="en-US"/>
@@ -3674,7 +3600,6 @@
         <w:br/>
       </w:r>
       <w:proofErr w:type="spellStart"/>
-      <w:proofErr w:type="gramStart"/>
       <w:r>
         <w:rPr>
           <w:lang w:val="en-US"/>
@@ -3692,14 +3617,7 @@
         <w:rPr>
           <w:lang w:val="en-US"/>
         </w:rPr>
-        <w:t>(</w:t>
-      </w:r>
-      <w:proofErr w:type="gramEnd"/>
-      <w:r>
-        <w:rPr>
-          <w:lang w:val="en-US"/>
-        </w:rPr>
-        <w:t>)</w:t>
+        <w:t>()</w:t>
       </w:r>
     </w:p>
     <w:p>
@@ -3745,9 +3663,12 @@
       </w:r>
       <w:proofErr w:type="spellStart"/>
       <w:r>
-        <w:t>Workbench.</w:t>
-      </w:r>
-      <w:proofErr w:type="spellEnd"/>
+        <w:t>Workbench</w:t>
+      </w:r>
+      <w:proofErr w:type="spellEnd"/>
+      <w:r>
+        <w:t>.</w:t>
+      </w:r>
     </w:p>
     <w:p>
       <w:pPr>
@@ -3870,33 +3791,27 @@
           <w:numId w:val="29"/>
         </w:numPr>
         <w:spacing w:after="0"/>
-      </w:pPr>
-      <w:r>
-        <w:t xml:space="preserve">Δεξί κλικ → </w:t>
-      </w:r>
-      <w:proofErr w:type="spellStart"/>
-      <w:r>
-        <w:t>Select</w:t>
-      </w:r>
-      <w:proofErr w:type="spellEnd"/>
-      <w:r>
-        <w:t xml:space="preserve"> </w:t>
-      </w:r>
-      <w:proofErr w:type="spellStart"/>
-      <w:r>
-        <w:t>Rows</w:t>
-      </w:r>
-      <w:proofErr w:type="spellEnd"/>
-      <w:r>
-        <w:t xml:space="preserve"> → </w:t>
-      </w:r>
-      <w:proofErr w:type="spellStart"/>
-      <w:r>
-        <w:t>Limit</w:t>
-      </w:r>
-      <w:proofErr w:type="spellEnd"/>
-      <w:r>
-        <w:t xml:space="preserve"> 1000</w:t>
+        <w:rPr>
+          <w:lang w:val="en-US"/>
+        </w:rPr>
+      </w:pPr>
+      <w:r>
+        <w:t>Δεξί</w:t>
+      </w:r>
+      <w:r>
+        <w:rPr>
+          <w:lang w:val="en-US"/>
+        </w:rPr>
+        <w:t xml:space="preserve"> </w:t>
+      </w:r>
+      <w:r>
+        <w:t>κλικ</w:t>
+      </w:r>
+      <w:r>
+        <w:rPr>
+          <w:lang w:val="en-US"/>
+        </w:rPr>
+        <w:t xml:space="preserve"> → Select Rows → Limit 1000</w:t>
       </w:r>
     </w:p>
     <w:p>
@@ -3936,6 +3851,9 @@
           <w:tab w:val="num" w:pos="720"/>
         </w:tabs>
         <w:spacing w:after="0"/>
+        <w:rPr>
+          <w:lang w:val="en-US"/>
+        </w:rPr>
       </w:pPr>
       <w:r>
         <w:rPr>
@@ -3955,14 +3873,7 @@
         <w:rPr>
           <w:lang w:val="en-US"/>
         </w:rPr>
-        <w:t>accounts_</w:t>
-      </w:r>
-      <w:proofErr w:type="gramStart"/>
-      <w:r>
-        <w:rPr>
-          <w:lang w:val="en-US"/>
-        </w:rPr>
-        <w:t>appuser</w:t>
+        <w:t>accounts_appuser</w:t>
       </w:r>
       <w:proofErr w:type="spellEnd"/>
       <w:r>
@@ -3971,7 +3882,6 @@
         </w:rPr>
         <w:t>;</w:t>
       </w:r>
-      <w:proofErr w:type="gramEnd"/>
     </w:p>
     <w:p>
       <w:pPr>
@@ -3979,6 +3889,9 @@
           <w:tab w:val="num" w:pos="720"/>
         </w:tabs>
         <w:spacing w:after="0"/>
+        <w:rPr>
+          <w:lang w:val="en-US"/>
+        </w:rPr>
       </w:pPr>
     </w:p>
     <w:p>
@@ -3987,9 +3900,6 @@
           <w:tab w:val="num" w:pos="720"/>
         </w:tabs>
         <w:spacing w:after="0"/>
-        <w:rPr>
-          <w:lang w:val="en-US"/>
-        </w:rPr>
       </w:pPr>
       <w:r>
         <w:t xml:space="preserve">Ο χρήστης παραμένει ακόμα και αν κλείσουμε τον </w:t>
@@ -4056,18 +3966,24 @@
           <w:numId w:val="33"/>
         </w:numPr>
         <w:spacing w:after="0"/>
+        <w:rPr>
+          <w:lang w:val="en-US"/>
+        </w:rPr>
       </w:pPr>
       <w:r>
         <w:t>Πήγαινε</w:t>
       </w:r>
       <w:r>
-        <w:t xml:space="preserve"> </w:t>
-      </w:r>
-      <w:r>
-        <w:t xml:space="preserve">Schemas → GDPR → Tables → </w:t>
-      </w:r>
-      <w:proofErr w:type="spellStart"/>
-      <w:r>
+        <w:rPr>
+          <w:lang w:val="en-US"/>
+        </w:rPr>
+        <w:t xml:space="preserve"> Schemas → GDPR → Tables → </w:t>
+      </w:r>
+      <w:proofErr w:type="spellStart"/>
+      <w:r>
+        <w:rPr>
+          <w:lang w:val="en-US"/>
+        </w:rPr>
         <w:t>accounts_appuser</w:t>
       </w:r>
       <w:proofErr w:type="spellEnd"/>
@@ -4175,6 +4091,706 @@
       <w:proofErr w:type="spellEnd"/>
       <w:r>
         <w:t>.</w:t>
+      </w:r>
+    </w:p>
+    <w:p>
+      <w:pPr>
+        <w:spacing w:after="0"/>
+        <w:rPr>
+          <w:lang w:val="en-US"/>
+        </w:rPr>
+      </w:pPr>
+    </w:p>
+    <w:p>
+      <w:pPr>
+        <w:spacing w:after="0"/>
+        <w:rPr>
+          <w:b/>
+          <w:bCs/>
+        </w:rPr>
+      </w:pPr>
+      <w:r>
+        <w:rPr>
+          <w:b/>
+          <w:bCs/>
+        </w:rPr>
+        <w:t xml:space="preserve">Στατική πολιτική </w:t>
+      </w:r>
+      <w:r>
+        <w:rPr>
+          <w:b/>
+          <w:bCs/>
+          <w:lang w:val="en-US"/>
+        </w:rPr>
+        <w:t>passwords</w:t>
+      </w:r>
+      <w:r>
+        <w:rPr>
+          <w:b/>
+          <w:bCs/>
+        </w:rPr>
+        <w:t xml:space="preserve"> και σε </w:t>
+      </w:r>
+      <w:r>
+        <w:rPr>
+          <w:b/>
+          <w:bCs/>
+          <w:lang w:val="en-US"/>
+        </w:rPr>
+        <w:t>frontend</w:t>
+      </w:r>
+      <w:r>
+        <w:rPr>
+          <w:b/>
+          <w:bCs/>
+        </w:rPr>
+        <w:t xml:space="preserve"> και σε </w:t>
+      </w:r>
+      <w:r>
+        <w:rPr>
+          <w:b/>
+          <w:bCs/>
+          <w:lang w:val="en-US"/>
+        </w:rPr>
+        <w:t>backend</w:t>
+      </w:r>
+    </w:p>
+    <w:p>
+      <w:pPr>
+        <w:spacing w:after="0"/>
+        <w:rPr>
+          <w:lang w:val="en-US"/>
+        </w:rPr>
+      </w:pPr>
+      <w:r>
+        <w:t xml:space="preserve">Βάζουμε στατική πολιτική στο </w:t>
+      </w:r>
+      <w:r>
+        <w:rPr>
+          <w:lang w:val="en-US"/>
+        </w:rPr>
+        <w:t>backend</w:t>
+      </w:r>
+      <w:r>
+        <w:t xml:space="preserve"> </w:t>
+      </w:r>
+      <w:r>
+        <w:t xml:space="preserve">για ασφάλεια και στο </w:t>
+      </w:r>
+      <w:r>
+        <w:rPr>
+          <w:lang w:val="en-US"/>
+        </w:rPr>
+        <w:t>frontend</w:t>
+      </w:r>
+      <w:r>
+        <w:t xml:space="preserve"> </w:t>
+      </w:r>
+      <w:r>
+        <w:t xml:space="preserve">για την εμπειρία του χρήστη. Το </w:t>
+      </w:r>
+      <w:r>
+        <w:rPr>
+          <w:lang w:val="en-US"/>
+        </w:rPr>
+        <w:t>backend</w:t>
+      </w:r>
+      <w:r>
+        <w:t xml:space="preserve"> </w:t>
+      </w:r>
+      <w:r>
+        <w:t xml:space="preserve">είναι υποχρεωτικό, γιατί είναι αξιόπιστο καθώς το </w:t>
+      </w:r>
+      <w:r>
+        <w:rPr>
+          <w:lang w:val="en-US"/>
+        </w:rPr>
+        <w:t>frontend</w:t>
+      </w:r>
+      <w:r>
+        <w:t xml:space="preserve"> </w:t>
+      </w:r>
+      <w:r>
+        <w:t>παρακάμπτεται εύκολα.</w:t>
+      </w:r>
+    </w:p>
+    <w:p>
+      <w:pPr>
+        <w:spacing w:after="0"/>
+        <w:rPr>
+          <w:lang w:val="en-US"/>
+        </w:rPr>
+      </w:pPr>
+      <w:r>
+        <w:t xml:space="preserve">Τα </w:t>
+      </w:r>
+      <w:r>
+        <w:rPr>
+          <w:lang w:val="en-US"/>
+        </w:rPr>
+        <w:t>best</w:t>
+      </w:r>
+      <w:r>
+        <w:t xml:space="preserve"> </w:t>
+      </w:r>
+      <w:r>
+        <w:rPr>
+          <w:lang w:val="en-US"/>
+        </w:rPr>
+        <w:t>practices</w:t>
+      </w:r>
+      <w:r>
+        <w:t xml:space="preserve"> </w:t>
+      </w:r>
+      <w:r>
+        <w:t xml:space="preserve">που χρησιμοποιήσαμε είναι βασισμένα στους κανόνες του </w:t>
+      </w:r>
+      <w:r>
+        <w:rPr>
+          <w:lang w:val="en-US"/>
+        </w:rPr>
+        <w:t>NIST</w:t>
+      </w:r>
+      <w:r>
+        <w:t xml:space="preserve"> </w:t>
+      </w:r>
+      <w:r>
+        <w:t xml:space="preserve">για τα </w:t>
+      </w:r>
+      <w:r>
+        <w:rPr>
+          <w:lang w:val="en-US"/>
+        </w:rPr>
+        <w:t>passwords</w:t>
+      </w:r>
+      <w:r>
+        <w:t xml:space="preserve"> (</w:t>
+      </w:r>
+      <w:r>
+        <w:t xml:space="preserve">3.1.1.2 </w:t>
+      </w:r>
+      <w:proofErr w:type="spellStart"/>
+      <w:r>
+        <w:t>Password</w:t>
+      </w:r>
+      <w:proofErr w:type="spellEnd"/>
+      <w:r>
+        <w:t xml:space="preserve"> </w:t>
+      </w:r>
+      <w:proofErr w:type="spellStart"/>
+      <w:r>
+        <w:t>Verifiers</w:t>
+      </w:r>
+      <w:proofErr w:type="spellEnd"/>
+      <w:r>
+        <w:t xml:space="preserve">): </w:t>
+      </w:r>
+      <w:hyperlink r:id="rId10" w:history="1">
+        <w:r>
+          <w:rPr>
+            <w:rStyle w:val="-"/>
+          </w:rPr>
+          <w:t>https://pages.nist.gov/800-63-4/sp800-63b.html</w:t>
+        </w:r>
+      </w:hyperlink>
+    </w:p>
+    <w:p>
+      <w:pPr>
+        <w:spacing w:after="0"/>
+      </w:pPr>
+      <w:r>
+        <w:t>Την μόνη αλλαγή που κάναμε ήταν να βάλουμε ελάχιστο αριθμό χαρακτήρων 8 και όχι 15 για διευκόλυνση των χρηστών.</w:t>
+      </w:r>
+    </w:p>
+    <w:p>
+      <w:pPr>
+        <w:spacing w:after="0"/>
+        <w:rPr>
+          <w:lang w:val="en-US"/>
+        </w:rPr>
+      </w:pPr>
+      <w:r>
+        <w:t>Συχνά</w:t>
+      </w:r>
+      <w:r>
+        <w:rPr>
+          <w:lang w:val="en-US"/>
+        </w:rPr>
+        <w:t xml:space="preserve"> </w:t>
+      </w:r>
+      <w:r>
+        <w:rPr>
+          <w:lang w:val="en-US"/>
+        </w:rPr>
+        <w:t xml:space="preserve">passwords: </w:t>
+      </w:r>
+      <w:hyperlink r:id="rId11" w:history="1">
+        <w:r>
+          <w:rPr>
+            <w:rStyle w:val="-"/>
+            <w:lang w:val="en-US"/>
+          </w:rPr>
+          <w:t>https://en.wikipedia.org/wiki/List_of_the_most_common_passwords</w:t>
+        </w:r>
+      </w:hyperlink>
+    </w:p>
+    <w:p>
+      <w:pPr>
+        <w:spacing w:after="0"/>
+      </w:pPr>
+      <w:r>
+        <w:t xml:space="preserve">Βάλαμε μόνο </w:t>
+      </w:r>
+      <w:r>
+        <w:rPr>
+          <w:lang w:val="en-US"/>
+        </w:rPr>
+        <w:t>passwords</w:t>
+      </w:r>
+      <w:r>
+        <w:t xml:space="preserve"> </w:t>
+      </w:r>
+      <w:r>
+        <w:t>από 8 ψηφία και πάνω.</w:t>
+      </w:r>
+    </w:p>
+    <w:p>
+      <w:pPr>
+        <w:spacing w:after="0"/>
+      </w:pPr>
+    </w:p>
+    <w:p>
+      <w:pPr>
+        <w:pStyle w:val="a6"/>
+        <w:numPr>
+          <w:ilvl w:val="0"/>
+          <w:numId w:val="17"/>
+        </w:numPr>
+        <w:spacing w:after="0"/>
+        <w:rPr>
+          <w:lang w:val="en-US"/>
+        </w:rPr>
+      </w:pPr>
+      <w:proofErr w:type="spellStart"/>
+      <w:r>
+        <w:t>accounts</w:t>
+      </w:r>
+      <w:proofErr w:type="spellEnd"/>
+      <w:r>
+        <w:t>/utils.py</w:t>
+      </w:r>
+    </w:p>
+    <w:p>
+      <w:pPr>
+        <w:spacing w:after="0"/>
+        <w:rPr>
+          <w:lang w:val="en-US"/>
+        </w:rPr>
+      </w:pPr>
+      <w:r>
+        <w:t xml:space="preserve">Κανόνες για τα </w:t>
+      </w:r>
+      <w:r>
+        <w:rPr>
+          <w:lang w:val="en-US"/>
+        </w:rPr>
+        <w:t>passwords</w:t>
+      </w:r>
+      <w:r>
+        <w:t xml:space="preserve"> </w:t>
+      </w:r>
+      <w:r>
+        <w:t xml:space="preserve">σύμφωνα με τα παραπάνω στο </w:t>
+      </w:r>
+      <w:r>
+        <w:rPr>
+          <w:lang w:val="en-US"/>
+        </w:rPr>
+        <w:t>backend</w:t>
+      </w:r>
+      <w:r>
+        <w:t>:</w:t>
+      </w:r>
+    </w:p>
+    <w:p>
+      <w:pPr>
+        <w:pStyle w:val="a6"/>
+        <w:numPr>
+          <w:ilvl w:val="0"/>
+          <w:numId w:val="36"/>
+        </w:numPr>
+        <w:spacing w:after="0"/>
+        <w:rPr>
+          <w:lang w:val="en-US"/>
+        </w:rPr>
+      </w:pPr>
+      <w:r>
+        <w:rPr>
+          <w:lang w:val="en-US"/>
+        </w:rPr>
+        <w:t xml:space="preserve">Password </w:t>
+      </w:r>
+      <w:r>
+        <w:t>υποχρεωτικό</w:t>
+      </w:r>
+    </w:p>
+    <w:p>
+      <w:pPr>
+        <w:pStyle w:val="a6"/>
+        <w:numPr>
+          <w:ilvl w:val="0"/>
+          <w:numId w:val="36"/>
+        </w:numPr>
+        <w:spacing w:after="0"/>
+        <w:rPr>
+          <w:lang w:val="en-US"/>
+        </w:rPr>
+      </w:pPr>
+      <w:r>
+        <w:rPr>
+          <w:lang w:val="en-US"/>
+        </w:rPr>
+        <w:t xml:space="preserve">Password &gt; 8 </w:t>
+      </w:r>
+      <w:r>
+        <w:t xml:space="preserve">και </w:t>
+      </w:r>
+      <w:r>
+        <w:rPr>
+          <w:lang w:val="en-US"/>
+        </w:rPr>
+        <w:t xml:space="preserve">&lt; 64 </w:t>
+      </w:r>
+      <w:r>
+        <w:t>χαρακτήρων</w:t>
+      </w:r>
+    </w:p>
+    <w:p>
+      <w:pPr>
+        <w:pStyle w:val="a6"/>
+        <w:numPr>
+          <w:ilvl w:val="0"/>
+          <w:numId w:val="36"/>
+        </w:numPr>
+        <w:spacing w:after="0"/>
+        <w:rPr>
+          <w:lang w:val="en-US"/>
+        </w:rPr>
+      </w:pPr>
+      <w:r>
+        <w:t xml:space="preserve">Να μην είναι συνηθισμένο </w:t>
+      </w:r>
+      <w:r>
+        <w:rPr>
+          <w:lang w:val="en-US"/>
+        </w:rPr>
+        <w:t>password</w:t>
+      </w:r>
+    </w:p>
+    <w:p>
+      <w:pPr>
+        <w:pStyle w:val="a6"/>
+        <w:numPr>
+          <w:ilvl w:val="0"/>
+          <w:numId w:val="36"/>
+        </w:numPr>
+        <w:spacing w:after="0"/>
+        <w:rPr>
+          <w:lang w:val="en-US"/>
+        </w:rPr>
+      </w:pPr>
+      <w:r>
+        <w:t xml:space="preserve">Να μην περιέχει το </w:t>
+      </w:r>
+      <w:r>
+        <w:rPr>
+          <w:lang w:val="en-US"/>
+        </w:rPr>
+        <w:t>username</w:t>
+      </w:r>
+    </w:p>
+    <w:p>
+      <w:pPr>
+        <w:spacing w:after="0"/>
+        <w:rPr>
+          <w:lang w:val="en-US"/>
+        </w:rPr>
+      </w:pPr>
+    </w:p>
+    <w:p>
+      <w:pPr>
+        <w:pStyle w:val="a6"/>
+        <w:numPr>
+          <w:ilvl w:val="0"/>
+          <w:numId w:val="17"/>
+        </w:numPr>
+        <w:spacing w:after="0"/>
+        <w:rPr>
+          <w:lang w:val="en-US"/>
+        </w:rPr>
+      </w:pPr>
+      <w:proofErr w:type="spellStart"/>
+      <w:r>
+        <w:t>accounts</w:t>
+      </w:r>
+      <w:proofErr w:type="spellEnd"/>
+      <w:r>
+        <w:t>/views.py</w:t>
+      </w:r>
+    </w:p>
+    <w:p>
+      <w:pPr>
+        <w:spacing w:after="0"/>
+      </w:pPr>
+      <w:r>
+        <w:t>Μέσα</w:t>
+      </w:r>
+      <w:r>
+        <w:rPr>
+          <w:lang w:val="en-US"/>
+        </w:rPr>
+        <w:t xml:space="preserve"> </w:t>
+      </w:r>
+      <w:r>
+        <w:t>στο</w:t>
+      </w:r>
+      <w:r>
+        <w:rPr>
+          <w:lang w:val="en-US"/>
+        </w:rPr>
+        <w:t xml:space="preserve"> register, </w:t>
+      </w:r>
+      <w:r>
+        <w:t>πρόσθεσ</w:t>
+      </w:r>
+      <w:r>
+        <w:t>α</w:t>
+      </w:r>
+      <w:r>
+        <w:rPr>
+          <w:lang w:val="en-US"/>
+        </w:rPr>
+        <w:t xml:space="preserve"> </w:t>
+      </w:r>
+      <w:r>
+        <w:t>το</w:t>
+      </w:r>
+      <w:r>
+        <w:rPr>
+          <w:lang w:val="en-US"/>
+        </w:rPr>
+        <w:t xml:space="preserve"> </w:t>
+      </w:r>
+      <w:r>
+        <w:rPr>
+          <w:lang w:val="en-US"/>
+        </w:rPr>
+        <w:t xml:space="preserve">validation </w:t>
+      </w:r>
+      <w:r>
+        <w:t>πριν</w:t>
+      </w:r>
+      <w:r>
+        <w:rPr>
+          <w:lang w:val="en-US"/>
+        </w:rPr>
+        <w:t xml:space="preserve"> </w:t>
+      </w:r>
+      <w:r>
+        <w:t>το</w:t>
+      </w:r>
+      <w:r>
+        <w:rPr>
+          <w:lang w:val="en-US"/>
+        </w:rPr>
+        <w:t xml:space="preserve"> </w:t>
+      </w:r>
+      <w:proofErr w:type="spellStart"/>
+      <w:r>
+        <w:rPr>
+          <w:lang w:val="en-US"/>
+        </w:rPr>
+        <w:t>User.objects.create</w:t>
+      </w:r>
+      <w:proofErr w:type="spellEnd"/>
+      <w:r>
+        <w:rPr>
+          <w:lang w:val="en-US"/>
+        </w:rPr>
+        <w:t>(...)</w:t>
+      </w:r>
+    </w:p>
+    <w:p>
+      <w:pPr>
+        <w:spacing w:after="0"/>
+      </w:pPr>
+    </w:p>
+    <w:p>
+      <w:pPr>
+        <w:pStyle w:val="a6"/>
+        <w:numPr>
+          <w:ilvl w:val="0"/>
+          <w:numId w:val="17"/>
+        </w:numPr>
+        <w:spacing w:after="0"/>
+        <w:rPr>
+          <w:lang w:val="en-US"/>
+        </w:rPr>
+      </w:pPr>
+      <w:proofErr w:type="spellStart"/>
+      <w:r>
+        <w:t>static</w:t>
+      </w:r>
+      <w:proofErr w:type="spellEnd"/>
+      <w:r>
+        <w:t>/</w:t>
+      </w:r>
+      <w:proofErr w:type="spellStart"/>
+      <w:r>
+        <w:t>js</w:t>
+      </w:r>
+      <w:proofErr w:type="spellEnd"/>
+      <w:r>
+        <w:t>/auth.js</w:t>
+      </w:r>
+    </w:p>
+    <w:p>
+      <w:pPr>
+        <w:spacing w:after="0"/>
+        <w:rPr>
+          <w:lang w:val="en-US"/>
+        </w:rPr>
+      </w:pPr>
+      <w:r>
+        <w:t xml:space="preserve">Πρόσθεσα τα αντίστοιχα που έβαλα και στο </w:t>
+      </w:r>
+      <w:r>
+        <w:rPr>
+          <w:lang w:val="en-US"/>
+        </w:rPr>
+        <w:t>utils</w:t>
+      </w:r>
+      <w:r>
+        <w:t xml:space="preserve"> </w:t>
+      </w:r>
+      <w:r>
+        <w:t xml:space="preserve">αλλά εδώ είναι για το </w:t>
+      </w:r>
+      <w:r>
+        <w:rPr>
+          <w:lang w:val="en-US"/>
+        </w:rPr>
+        <w:t>frontend</w:t>
+      </w:r>
+      <w:r>
+        <w:t xml:space="preserve">. </w:t>
+      </w:r>
+      <w:r>
+        <w:rPr>
+          <w:lang w:val="en-US"/>
+        </w:rPr>
+        <w:t>Client</w:t>
+      </w:r>
+      <w:r>
+        <w:t>-</w:t>
+      </w:r>
+      <w:r>
+        <w:rPr>
+          <w:lang w:val="en-US"/>
+        </w:rPr>
+        <w:t>side</w:t>
+      </w:r>
+      <w:r>
+        <w:t xml:space="preserve"> έλεγχο πριν γίνει το </w:t>
+      </w:r>
+      <w:r>
+        <w:rPr>
+          <w:lang w:val="en-US"/>
+        </w:rPr>
+        <w:t>fetch.</w:t>
+      </w:r>
+    </w:p>
+    <w:p>
+      <w:pPr>
+        <w:spacing w:after="0"/>
+        <w:rPr>
+          <w:lang w:val="en-US"/>
+        </w:rPr>
+      </w:pPr>
+    </w:p>
+    <w:p>
+      <w:pPr>
+        <w:pStyle w:val="a6"/>
+        <w:numPr>
+          <w:ilvl w:val="0"/>
+          <w:numId w:val="17"/>
+        </w:numPr>
+        <w:spacing w:after="0"/>
+      </w:pPr>
+      <w:r>
+        <w:t>index.html</w:t>
+      </w:r>
+    </w:p>
+    <w:p>
+      <w:pPr>
+        <w:spacing w:after="0"/>
+      </w:pPr>
+      <w:r>
+        <w:t xml:space="preserve">Κάτω από το πεδίο </w:t>
+      </w:r>
+      <w:proofErr w:type="spellStart"/>
+      <w:r>
+        <w:t>password</w:t>
+      </w:r>
+      <w:proofErr w:type="spellEnd"/>
+      <w:r>
+        <w:t xml:space="preserve"> στο </w:t>
+      </w:r>
+      <w:proofErr w:type="spellStart"/>
+      <w:r>
+        <w:t>register</w:t>
+      </w:r>
+      <w:proofErr w:type="spellEnd"/>
+      <w:r>
+        <w:t xml:space="preserve"> </w:t>
+      </w:r>
+      <w:proofErr w:type="spellStart"/>
+      <w:r>
+        <w:t>form</w:t>
+      </w:r>
+      <w:proofErr w:type="spellEnd"/>
+      <w:r>
+        <w:t xml:space="preserve"> </w:t>
+      </w:r>
+      <w:r>
+        <w:t>έβαλα</w:t>
+      </w:r>
+      <w:r>
+        <w:t xml:space="preserve"> ένα μικρό μήνυμα</w:t>
+      </w:r>
+      <w:r>
+        <w:t>.</w:t>
+      </w:r>
+    </w:p>
+    <w:p>
+      <w:pPr>
+        <w:spacing w:after="0"/>
+        <w:rPr>
+          <w:lang w:val="en-US"/>
+        </w:rPr>
+      </w:pPr>
+      <w:r>
+        <w:rPr>
+          <w:lang w:val="en-US"/>
+        </w:rPr>
+        <w:t>Client-side validation prevents unnecessary requests and improves user experience,</w:t>
+      </w:r>
+      <w:r>
+        <w:rPr>
+          <w:lang w:val="en-US"/>
+        </w:rPr>
+        <w:br/>
+        <w:t>while server-side validation ensures that security policies cannot be bypassed.</w:t>
       </w:r>
     </w:p>
     <w:sectPr>
@@ -5435,6 +6051,119 @@
     </w:lvl>
   </w:abstractNum>
   <w:abstractNum w:abstractNumId="9" w15:restartNumberingAfterBreak="0">
+    <w:nsid w:val="25723163"/>
+    <w:multiLevelType w:val="hybridMultilevel"/>
+    <w:tmpl w:val="94364536"/>
+    <w:lvl w:ilvl="0" w:tplc="1368EA30">
+      <w:start w:val="3"/>
+      <w:numFmt w:val="bullet"/>
+      <w:lvlText w:val="-"/>
+      <w:lvlJc w:val="left"/>
+      <w:pPr>
+        <w:ind w:left="720" w:hanging="360"/>
+      </w:pPr>
+      <w:rPr>
+        <w:rFonts w:ascii="Aptos" w:eastAsiaTheme="minorHAnsi" w:hAnsi="Aptos" w:cstheme="minorBidi" w:hint="default"/>
+      </w:rPr>
+    </w:lvl>
+    <w:lvl w:ilvl="1" w:tplc="04080003" w:tentative="1">
+      <w:start w:val="1"/>
+      <w:numFmt w:val="bullet"/>
+      <w:lvlText w:val="o"/>
+      <w:lvlJc w:val="left"/>
+      <w:pPr>
+        <w:ind w:left="1440" w:hanging="360"/>
+      </w:pPr>
+      <w:rPr>
+        <w:rFonts w:ascii="Courier New" w:hAnsi="Courier New" w:cs="Courier New" w:hint="default"/>
+      </w:rPr>
+    </w:lvl>
+    <w:lvl w:ilvl="2" w:tplc="04080005" w:tentative="1">
+      <w:start w:val="1"/>
+      <w:numFmt w:val="bullet"/>
+      <w:lvlText w:val=""/>
+      <w:lvlJc w:val="left"/>
+      <w:pPr>
+        <w:ind w:left="2160" w:hanging="360"/>
+      </w:pPr>
+      <w:rPr>
+        <w:rFonts w:ascii="Wingdings" w:hAnsi="Wingdings" w:hint="default"/>
+      </w:rPr>
+    </w:lvl>
+    <w:lvl w:ilvl="3" w:tplc="04080001" w:tentative="1">
+      <w:start w:val="1"/>
+      <w:numFmt w:val="bullet"/>
+      <w:lvlText w:val=""/>
+      <w:lvlJc w:val="left"/>
+      <w:pPr>
+        <w:ind w:left="2880" w:hanging="360"/>
+      </w:pPr>
+      <w:rPr>
+        <w:rFonts w:ascii="Symbol" w:hAnsi="Symbol" w:hint="default"/>
+      </w:rPr>
+    </w:lvl>
+    <w:lvl w:ilvl="4" w:tplc="04080003" w:tentative="1">
+      <w:start w:val="1"/>
+      <w:numFmt w:val="bullet"/>
+      <w:lvlText w:val="o"/>
+      <w:lvlJc w:val="left"/>
+      <w:pPr>
+        <w:ind w:left="3600" w:hanging="360"/>
+      </w:pPr>
+      <w:rPr>
+        <w:rFonts w:ascii="Courier New" w:hAnsi="Courier New" w:cs="Courier New" w:hint="default"/>
+      </w:rPr>
+    </w:lvl>
+    <w:lvl w:ilvl="5" w:tplc="04080005" w:tentative="1">
+      <w:start w:val="1"/>
+      <w:numFmt w:val="bullet"/>
+      <w:lvlText w:val=""/>
+      <w:lvlJc w:val="left"/>
+      <w:pPr>
+        <w:ind w:left="4320" w:hanging="360"/>
+      </w:pPr>
+      <w:rPr>
+        <w:rFonts w:ascii="Wingdings" w:hAnsi="Wingdings" w:hint="default"/>
+      </w:rPr>
+    </w:lvl>
+    <w:lvl w:ilvl="6" w:tplc="04080001" w:tentative="1">
+      <w:start w:val="1"/>
+      <w:numFmt w:val="bullet"/>
+      <w:lvlText w:val=""/>
+      <w:lvlJc w:val="left"/>
+      <w:pPr>
+        <w:ind w:left="5040" w:hanging="360"/>
+      </w:pPr>
+      <w:rPr>
+        <w:rFonts w:ascii="Symbol" w:hAnsi="Symbol" w:hint="default"/>
+      </w:rPr>
+    </w:lvl>
+    <w:lvl w:ilvl="7" w:tplc="04080003" w:tentative="1">
+      <w:start w:val="1"/>
+      <w:numFmt w:val="bullet"/>
+      <w:lvlText w:val="o"/>
+      <w:lvlJc w:val="left"/>
+      <w:pPr>
+        <w:ind w:left="5760" w:hanging="360"/>
+      </w:pPr>
+      <w:rPr>
+        <w:rFonts w:ascii="Courier New" w:hAnsi="Courier New" w:cs="Courier New" w:hint="default"/>
+      </w:rPr>
+    </w:lvl>
+    <w:lvl w:ilvl="8" w:tplc="04080005" w:tentative="1">
+      <w:start w:val="1"/>
+      <w:numFmt w:val="bullet"/>
+      <w:lvlText w:val=""/>
+      <w:lvlJc w:val="left"/>
+      <w:pPr>
+        <w:ind w:left="6480" w:hanging="360"/>
+      </w:pPr>
+      <w:rPr>
+        <w:rFonts w:ascii="Wingdings" w:hAnsi="Wingdings" w:hint="default"/>
+      </w:rPr>
+    </w:lvl>
+  </w:abstractNum>
+  <w:abstractNum w:abstractNumId="10" w15:restartNumberingAfterBreak="0">
     <w:nsid w:val="2B9C3966"/>
     <w:multiLevelType w:val="hybridMultilevel"/>
     <w:tmpl w:val="823E0CCE"/>
@@ -5547,7 +6276,7 @@
       </w:rPr>
     </w:lvl>
   </w:abstractNum>
-  <w:abstractNum w:abstractNumId="10" w15:restartNumberingAfterBreak="0">
+  <w:abstractNum w:abstractNumId="11" w15:restartNumberingAfterBreak="0">
     <w:nsid w:val="2C4216F8"/>
     <w:multiLevelType w:val="multilevel"/>
     <w:tmpl w:val="AF62E3A0"/>
@@ -5696,7 +6425,7 @@
       </w:rPr>
     </w:lvl>
   </w:abstractNum>
-  <w:abstractNum w:abstractNumId="11" w15:restartNumberingAfterBreak="0">
+  <w:abstractNum w:abstractNumId="12" w15:restartNumberingAfterBreak="0">
     <w:nsid w:val="2FF75BE5"/>
     <w:multiLevelType w:val="multilevel"/>
     <w:tmpl w:val="3F505ABE"/>
@@ -5809,7 +6538,7 @@
       </w:pPr>
     </w:lvl>
   </w:abstractNum>
-  <w:abstractNum w:abstractNumId="12" w15:restartNumberingAfterBreak="0">
+  <w:abstractNum w:abstractNumId="13" w15:restartNumberingAfterBreak="0">
     <w:nsid w:val="335E5977"/>
     <w:multiLevelType w:val="multilevel"/>
     <w:tmpl w:val="D02002A4"/>
@@ -5958,7 +6687,7 @@
       </w:rPr>
     </w:lvl>
   </w:abstractNum>
-  <w:abstractNum w:abstractNumId="13" w15:restartNumberingAfterBreak="0">
+  <w:abstractNum w:abstractNumId="14" w15:restartNumberingAfterBreak="0">
     <w:nsid w:val="347E0D6B"/>
     <w:multiLevelType w:val="multilevel"/>
     <w:tmpl w:val="07BE7F02"/>
@@ -6071,7 +6800,7 @@
       </w:pPr>
     </w:lvl>
   </w:abstractNum>
-  <w:abstractNum w:abstractNumId="14" w15:restartNumberingAfterBreak="0">
+  <w:abstractNum w:abstractNumId="15" w15:restartNumberingAfterBreak="0">
     <w:nsid w:val="352102CD"/>
     <w:multiLevelType w:val="multilevel"/>
     <w:tmpl w:val="1F0ED59C"/>
@@ -6184,7 +6913,7 @@
       </w:pPr>
     </w:lvl>
   </w:abstractNum>
-  <w:abstractNum w:abstractNumId="15" w15:restartNumberingAfterBreak="0">
+  <w:abstractNum w:abstractNumId="16" w15:restartNumberingAfterBreak="0">
     <w:nsid w:val="3AB312F9"/>
     <w:multiLevelType w:val="multilevel"/>
     <w:tmpl w:val="373AFFA2"/>
@@ -6333,7 +7062,7 @@
       </w:rPr>
     </w:lvl>
   </w:abstractNum>
-  <w:abstractNum w:abstractNumId="16" w15:restartNumberingAfterBreak="0">
+  <w:abstractNum w:abstractNumId="17" w15:restartNumberingAfterBreak="0">
     <w:nsid w:val="3BE80690"/>
     <w:multiLevelType w:val="multilevel"/>
     <w:tmpl w:val="D73A804C"/>
@@ -6482,7 +7211,7 @@
       </w:rPr>
     </w:lvl>
   </w:abstractNum>
-  <w:abstractNum w:abstractNumId="17" w15:restartNumberingAfterBreak="0">
+  <w:abstractNum w:abstractNumId="18" w15:restartNumberingAfterBreak="0">
     <w:nsid w:val="3E0B7CB1"/>
     <w:multiLevelType w:val="multilevel"/>
     <w:tmpl w:val="EBD020EE"/>
@@ -6631,7 +7360,7 @@
       </w:rPr>
     </w:lvl>
   </w:abstractNum>
-  <w:abstractNum w:abstractNumId="18" w15:restartNumberingAfterBreak="0">
+  <w:abstractNum w:abstractNumId="19" w15:restartNumberingAfterBreak="0">
     <w:nsid w:val="3F376691"/>
     <w:multiLevelType w:val="multilevel"/>
     <w:tmpl w:val="448CFCCC"/>
@@ -6780,7 +7509,7 @@
       </w:rPr>
     </w:lvl>
   </w:abstractNum>
-  <w:abstractNum w:abstractNumId="19" w15:restartNumberingAfterBreak="0">
+  <w:abstractNum w:abstractNumId="20" w15:restartNumberingAfterBreak="0">
     <w:nsid w:val="411F7287"/>
     <w:multiLevelType w:val="hybridMultilevel"/>
     <w:tmpl w:val="F350C4B4"/>
@@ -6869,7 +7598,7 @@
       </w:pPr>
     </w:lvl>
   </w:abstractNum>
-  <w:abstractNum w:abstractNumId="20" w15:restartNumberingAfterBreak="0">
+  <w:abstractNum w:abstractNumId="21" w15:restartNumberingAfterBreak="0">
     <w:nsid w:val="420D3C9B"/>
     <w:multiLevelType w:val="multilevel"/>
     <w:tmpl w:val="AAAAB9CE"/>
@@ -6982,7 +7711,7 @@
       </w:pPr>
     </w:lvl>
   </w:abstractNum>
-  <w:abstractNum w:abstractNumId="21" w15:restartNumberingAfterBreak="0">
+  <w:abstractNum w:abstractNumId="22" w15:restartNumberingAfterBreak="0">
     <w:nsid w:val="455D397C"/>
     <w:multiLevelType w:val="multilevel"/>
     <w:tmpl w:val="2974B04A"/>
@@ -7131,7 +7860,7 @@
       </w:rPr>
     </w:lvl>
   </w:abstractNum>
-  <w:abstractNum w:abstractNumId="22" w15:restartNumberingAfterBreak="0">
+  <w:abstractNum w:abstractNumId="23" w15:restartNumberingAfterBreak="0">
     <w:nsid w:val="4B0D7F2E"/>
     <w:multiLevelType w:val="multilevel"/>
     <w:tmpl w:val="CC126BA2"/>
@@ -7280,7 +8009,7 @@
       </w:rPr>
     </w:lvl>
   </w:abstractNum>
-  <w:abstractNum w:abstractNumId="23" w15:restartNumberingAfterBreak="0">
+  <w:abstractNum w:abstractNumId="24" w15:restartNumberingAfterBreak="0">
     <w:nsid w:val="4C867679"/>
     <w:multiLevelType w:val="multilevel"/>
     <w:tmpl w:val="81B454F2"/>
@@ -7429,7 +8158,7 @@
       </w:rPr>
     </w:lvl>
   </w:abstractNum>
-  <w:abstractNum w:abstractNumId="24" w15:restartNumberingAfterBreak="0">
+  <w:abstractNum w:abstractNumId="25" w15:restartNumberingAfterBreak="0">
     <w:nsid w:val="4CA22A39"/>
     <w:multiLevelType w:val="multilevel"/>
     <w:tmpl w:val="2B8AD1DA"/>
@@ -7542,7 +8271,7 @@
       </w:pPr>
     </w:lvl>
   </w:abstractNum>
-  <w:abstractNum w:abstractNumId="25" w15:restartNumberingAfterBreak="0">
+  <w:abstractNum w:abstractNumId="26" w15:restartNumberingAfterBreak="0">
     <w:nsid w:val="4D8125D0"/>
     <w:multiLevelType w:val="multilevel"/>
     <w:tmpl w:val="B5C27D5A"/>
@@ -7691,7 +8420,7 @@
       </w:rPr>
     </w:lvl>
   </w:abstractNum>
-  <w:abstractNum w:abstractNumId="26" w15:restartNumberingAfterBreak="0">
+  <w:abstractNum w:abstractNumId="27" w15:restartNumberingAfterBreak="0">
     <w:nsid w:val="56CB6E08"/>
     <w:multiLevelType w:val="multilevel"/>
     <w:tmpl w:val="D47E74C0"/>
@@ -7840,10 +8569,10 @@
       </w:rPr>
     </w:lvl>
   </w:abstractNum>
-  <w:abstractNum w:abstractNumId="27" w15:restartNumberingAfterBreak="0">
+  <w:abstractNum w:abstractNumId="28" w15:restartNumberingAfterBreak="0">
     <w:nsid w:val="5A54234E"/>
     <w:multiLevelType w:val="hybridMultilevel"/>
-    <w:tmpl w:val="3684F440"/>
+    <w:tmpl w:val="3F26DFE4"/>
     <w:lvl w:ilvl="0" w:tplc="04080001">
       <w:start w:val="1"/>
       <w:numFmt w:val="bullet"/>
@@ -7953,7 +8682,7 @@
       </w:rPr>
     </w:lvl>
   </w:abstractNum>
-  <w:abstractNum w:abstractNumId="28" w15:restartNumberingAfterBreak="0">
+  <w:abstractNum w:abstractNumId="29" w15:restartNumberingAfterBreak="0">
     <w:nsid w:val="64AF602D"/>
     <w:multiLevelType w:val="hybridMultilevel"/>
     <w:tmpl w:val="3176D7C2"/>
@@ -8042,7 +8771,7 @@
       </w:pPr>
     </w:lvl>
   </w:abstractNum>
-  <w:abstractNum w:abstractNumId="29" w15:restartNumberingAfterBreak="0">
+  <w:abstractNum w:abstractNumId="30" w15:restartNumberingAfterBreak="0">
     <w:nsid w:val="689B5A12"/>
     <w:multiLevelType w:val="multilevel"/>
     <w:tmpl w:val="618E22AE"/>
@@ -8191,7 +8920,7 @@
       </w:rPr>
     </w:lvl>
   </w:abstractNum>
-  <w:abstractNum w:abstractNumId="30" w15:restartNumberingAfterBreak="0">
+  <w:abstractNum w:abstractNumId="31" w15:restartNumberingAfterBreak="0">
     <w:nsid w:val="6E674580"/>
     <w:multiLevelType w:val="multilevel"/>
     <w:tmpl w:val="0DF8321C"/>
@@ -8340,7 +9069,7 @@
       </w:rPr>
     </w:lvl>
   </w:abstractNum>
-  <w:abstractNum w:abstractNumId="31" w15:restartNumberingAfterBreak="0">
+  <w:abstractNum w:abstractNumId="32" w15:restartNumberingAfterBreak="0">
     <w:nsid w:val="76933D4C"/>
     <w:multiLevelType w:val="multilevel"/>
     <w:tmpl w:val="8528D61A"/>
@@ -8489,7 +9218,7 @@
       </w:rPr>
     </w:lvl>
   </w:abstractNum>
-  <w:abstractNum w:abstractNumId="32" w15:restartNumberingAfterBreak="0">
+  <w:abstractNum w:abstractNumId="33" w15:restartNumberingAfterBreak="0">
     <w:nsid w:val="776A696E"/>
     <w:multiLevelType w:val="multilevel"/>
     <w:tmpl w:val="F9F6194E"/>
@@ -8602,7 +9331,7 @@
       </w:pPr>
     </w:lvl>
   </w:abstractNum>
-  <w:abstractNum w:abstractNumId="33" w15:restartNumberingAfterBreak="0">
+  <w:abstractNum w:abstractNumId="34" w15:restartNumberingAfterBreak="0">
     <w:nsid w:val="7807662E"/>
     <w:multiLevelType w:val="multilevel"/>
     <w:tmpl w:val="65526FE4"/>
@@ -8751,7 +9480,7 @@
       </w:rPr>
     </w:lvl>
   </w:abstractNum>
-  <w:abstractNum w:abstractNumId="34" w15:restartNumberingAfterBreak="0">
+  <w:abstractNum w:abstractNumId="35" w15:restartNumberingAfterBreak="0">
     <w:nsid w:val="7C0A720D"/>
     <w:multiLevelType w:val="multilevel"/>
     <w:tmpl w:val="660AE7AE"/>
@@ -8901,13 +9630,13 @@
     </w:lvl>
   </w:abstractNum>
   <w:num w:numId="1" w16cid:durableId="830828936">
-    <w:abstractNumId w:val="9"/>
+    <w:abstractNumId w:val="10"/>
   </w:num>
   <w:num w:numId="2" w16cid:durableId="1777601694">
-    <w:abstractNumId w:val="30"/>
+    <w:abstractNumId w:val="31"/>
   </w:num>
   <w:num w:numId="3" w16cid:durableId="986085624">
-    <w:abstractNumId w:val="15"/>
+    <w:abstractNumId w:val="16"/>
   </w:num>
   <w:num w:numId="4" w16cid:durableId="295183899">
     <w:abstractNumId w:val="2"/>
@@ -8916,94 +9645,97 @@
     <w:abstractNumId w:val="8"/>
   </w:num>
   <w:num w:numId="6" w16cid:durableId="1495224728">
-    <w:abstractNumId w:val="21"/>
+    <w:abstractNumId w:val="22"/>
   </w:num>
   <w:num w:numId="7" w16cid:durableId="1784230336">
     <w:abstractNumId w:val="0"/>
   </w:num>
   <w:num w:numId="8" w16cid:durableId="331295978">
+    <w:abstractNumId w:val="24"/>
+  </w:num>
+  <w:num w:numId="9" w16cid:durableId="1305620030">
     <w:abstractNumId w:val="23"/>
   </w:num>
-  <w:num w:numId="9" w16cid:durableId="1305620030">
-    <w:abstractNumId w:val="22"/>
-  </w:num>
   <w:num w:numId="10" w16cid:durableId="1358962906">
-    <w:abstractNumId w:val="17"/>
+    <w:abstractNumId w:val="18"/>
   </w:num>
   <w:num w:numId="11" w16cid:durableId="1041133741">
     <w:abstractNumId w:val="5"/>
   </w:num>
   <w:num w:numId="12" w16cid:durableId="130173889">
-    <w:abstractNumId w:val="33"/>
+    <w:abstractNumId w:val="34"/>
   </w:num>
   <w:num w:numId="13" w16cid:durableId="1490052240">
-    <w:abstractNumId w:val="34"/>
+    <w:abstractNumId w:val="35"/>
   </w:num>
   <w:num w:numId="14" w16cid:durableId="444008152">
-    <w:abstractNumId w:val="10"/>
+    <w:abstractNumId w:val="11"/>
   </w:num>
   <w:num w:numId="15" w16cid:durableId="939602951">
-    <w:abstractNumId w:val="25"/>
+    <w:abstractNumId w:val="26"/>
   </w:num>
   <w:num w:numId="16" w16cid:durableId="1384863813">
-    <w:abstractNumId w:val="12"/>
+    <w:abstractNumId w:val="13"/>
   </w:num>
   <w:num w:numId="17" w16cid:durableId="943464705">
-    <w:abstractNumId w:val="27"/>
+    <w:abstractNumId w:val="28"/>
   </w:num>
   <w:num w:numId="18" w16cid:durableId="1632789671">
-    <w:abstractNumId w:val="18"/>
+    <w:abstractNumId w:val="19"/>
   </w:num>
   <w:num w:numId="19" w16cid:durableId="934704678">
     <w:abstractNumId w:val="4"/>
   </w:num>
   <w:num w:numId="20" w16cid:durableId="1504591436">
-    <w:abstractNumId w:val="28"/>
+    <w:abstractNumId w:val="29"/>
   </w:num>
   <w:num w:numId="21" w16cid:durableId="452942399">
     <w:abstractNumId w:val="7"/>
   </w:num>
   <w:num w:numId="22" w16cid:durableId="759255251">
-    <w:abstractNumId w:val="16"/>
+    <w:abstractNumId w:val="17"/>
   </w:num>
   <w:num w:numId="23" w16cid:durableId="2039501596">
-    <w:abstractNumId w:val="29"/>
+    <w:abstractNumId w:val="30"/>
   </w:num>
   <w:num w:numId="24" w16cid:durableId="1373505725">
     <w:abstractNumId w:val="6"/>
   </w:num>
   <w:num w:numId="25" w16cid:durableId="461847899">
-    <w:abstractNumId w:val="31"/>
+    <w:abstractNumId w:val="32"/>
   </w:num>
   <w:num w:numId="26" w16cid:durableId="1994411415">
     <w:abstractNumId w:val="3"/>
   </w:num>
   <w:num w:numId="27" w16cid:durableId="1173104375">
-    <w:abstractNumId w:val="26"/>
+    <w:abstractNumId w:val="27"/>
   </w:num>
   <w:num w:numId="28" w16cid:durableId="243926305">
-    <w:abstractNumId w:val="19"/>
+    <w:abstractNumId w:val="20"/>
   </w:num>
   <w:num w:numId="29" w16cid:durableId="348221582">
-    <w:abstractNumId w:val="32"/>
+    <w:abstractNumId w:val="33"/>
   </w:num>
   <w:num w:numId="30" w16cid:durableId="1264873720">
-    <w:abstractNumId w:val="20"/>
+    <w:abstractNumId w:val="21"/>
   </w:num>
   <w:num w:numId="31" w16cid:durableId="1898776818">
-    <w:abstractNumId w:val="13"/>
+    <w:abstractNumId w:val="14"/>
   </w:num>
   <w:num w:numId="32" w16cid:durableId="288049475">
-    <w:abstractNumId w:val="24"/>
+    <w:abstractNumId w:val="25"/>
   </w:num>
   <w:num w:numId="33" w16cid:durableId="1678190374">
-    <w:abstractNumId w:val="11"/>
+    <w:abstractNumId w:val="12"/>
   </w:num>
   <w:num w:numId="34" w16cid:durableId="461852227">
     <w:abstractNumId w:val="1"/>
   </w:num>
   <w:num w:numId="35" w16cid:durableId="677848341">
-    <w:abstractNumId w:val="14"/>
+    <w:abstractNumId w:val="15"/>
+  </w:num>
+  <w:num w:numId="36" w16cid:durableId="445008633">
+    <w:abstractNumId w:val="9"/>
   </w:num>
 </w:numbering>
 </file>
@@ -9482,7 +10214,6 @@
     <w:next w:val="a"/>
     <w:link w:val="4Char"/>
     <w:uiPriority w:val="9"/>
-    <w:semiHidden/>
     <w:unhideWhenUsed/>
     <w:qFormat/>
     <w:rsid w:val="00207D43"/>
@@ -9680,7 +10411,6 @@
     <w:basedOn w:val="a0"/>
     <w:link w:val="4"/>
     <w:uiPriority w:val="9"/>
-    <w:semiHidden/>
     <w:rsid w:val="00207D43"/>
     <w:rPr>
       <w:rFonts w:eastAsiaTheme="majorEastAsia" w:cstheme="majorBidi"/>

</xml_diff>